<commit_message>
update: thesis & TCSE 0701
</commit_message>
<xml_diff>
--- a/docs/thesis/TCSE2026_楊宏傑.docx
+++ b/docs/thesis/TCSE2026_楊宏傑.docx
@@ -69,21 +69,7 @@
         <w:rPr>
           <w:rFonts w:eastAsia="標楷體" w:hint="eastAsia"/>
         </w:rPr>
-        <w:t>國立</w:t>
-      </w:r>
-      <w:proofErr w:type="gramStart"/>
-      <w:r>
-        <w:rPr>
-          <w:rFonts w:eastAsia="標楷體" w:hint="eastAsia"/>
-        </w:rPr>
-        <w:t>臺</w:t>
-      </w:r>
-      <w:proofErr w:type="gramEnd"/>
-      <w:r>
-        <w:rPr>
-          <w:rFonts w:eastAsia="標楷體" w:hint="eastAsia"/>
-        </w:rPr>
-        <w:t>北科技大學資訊工程系</w:t>
+        <w:t>國立臺北科技大學資訊工程系</w:t>
       </w:r>
     </w:p>
     <w:p>
@@ -138,13 +124,8 @@
       <w:r>
         <w:t>{</w:t>
       </w:r>
-      <w:proofErr w:type="spellStart"/>
-      <w:r>
-        <w:t>jykuo</w:t>
-      </w:r>
-      <w:proofErr w:type="spellEnd"/>
-      <w:r>
-        <w:t xml:space="preserve">, </w:t>
+      <w:r>
+        <w:t xml:space="preserve">jykuo, </w:t>
       </w:r>
       <w:r>
         <w:rPr>
@@ -232,23 +213,7 @@
           <w:rFonts w:eastAsia="標楷體"/>
           <w:sz w:val="20"/>
         </w:rPr>
-        <w:t>隨著電子商務快速發展與需求多樣化，物流配送規劃面臨更高的效率與成本挑戰。本研究</w:t>
-      </w:r>
-      <w:proofErr w:type="gramStart"/>
-      <w:r>
-        <w:rPr>
-          <w:rFonts w:eastAsia="標楷體"/>
-          <w:sz w:val="20"/>
-        </w:rPr>
-        <w:t>以某物流</w:t>
-      </w:r>
-      <w:proofErr w:type="gramEnd"/>
-      <w:r>
-        <w:rPr>
-          <w:rFonts w:eastAsia="標楷體"/>
-          <w:sz w:val="20"/>
-        </w:rPr>
-        <w:t>公司配送資料為基礎，針對固定主線下因需求波動所產生之超載與支援線調度問題，提出一套兼顧實務可行性與最佳化效益</w:t>
+        <w:t>隨著電子商務快速發展與需求多樣化，物流配送規劃面臨更高的效率與成本挑戰。本研究以某物流公司配送資料為基礎，針對固定主線下因需求波動所產生之超載與支援線調度問題，提出一套兼顧實務可行性與最佳化效益</w:t>
       </w:r>
       <w:r>
         <w:rPr>
@@ -290,23 +255,7 @@
           <w:rFonts w:eastAsia="標楷體"/>
           <w:sz w:val="20"/>
         </w:rPr>
-        <w:t>限制，並將問題建構為分階段之組合最佳化架構，分別處理店</w:t>
-      </w:r>
-      <w:proofErr w:type="gramStart"/>
-      <w:r>
-        <w:rPr>
-          <w:rFonts w:eastAsia="標楷體"/>
-          <w:sz w:val="20"/>
-        </w:rPr>
-        <w:t>舖</w:t>
-      </w:r>
-      <w:proofErr w:type="gramEnd"/>
-      <w:r>
-        <w:rPr>
-          <w:rFonts w:eastAsia="標楷體"/>
-          <w:sz w:val="20"/>
-        </w:rPr>
-        <w:t>抽取、重新分配與支援線規劃，以降低搜尋空間並提升解品質。</w:t>
+        <w:t>限制，並將問題建構為分階段之組合最佳化架構，分別處理店舖抽取、重新分配與支援線規劃，以降低搜尋空間並提升解品質。</w:t>
       </w:r>
       <w:r>
         <w:rPr>
@@ -336,7 +285,6 @@
         </w:rPr>
         <w:t>)</w:t>
       </w:r>
-      <w:proofErr w:type="gramStart"/>
       <w:r>
         <w:rPr>
           <w:rFonts w:eastAsia="標楷體"/>
@@ -344,7 +292,6 @@
         </w:rPr>
         <w:t>與蟻群演算法</w:t>
       </w:r>
-      <w:proofErr w:type="gramEnd"/>
       <w:r>
         <w:rPr>
           <w:rFonts w:eastAsia="標楷體" w:hint="eastAsia"/>
@@ -373,21 +320,12 @@
         </w:rPr>
         <w:t>，並透過修復機制確保解之可行性。</w:t>
       </w:r>
-      <w:proofErr w:type="gramStart"/>
-      <w:r>
-        <w:rPr>
-          <w:rFonts w:eastAsia="標楷體"/>
-          <w:sz w:val="20"/>
-        </w:rPr>
-        <w:t>此外，</w:t>
-      </w:r>
-      <w:proofErr w:type="gramEnd"/>
-      <w:r>
-        <w:rPr>
-          <w:rFonts w:eastAsia="標楷體"/>
-          <w:sz w:val="20"/>
-        </w:rPr>
-        <w:t>本研究除於</w:t>
+      <w:r>
+        <w:rPr>
+          <w:rFonts w:eastAsia="標楷體"/>
+          <w:sz w:val="20"/>
+        </w:rPr>
+        <w:t>此外，本研究除於</w:t>
       </w:r>
       <w:r>
         <w:rPr>
@@ -544,17 +482,8 @@
           <w:rFonts w:eastAsia="標楷體"/>
           <w:sz w:val="20"/>
         </w:rPr>
-        <w:t>基因演算法、</w:t>
-      </w:r>
-      <w:proofErr w:type="gramStart"/>
-      <w:r>
-        <w:rPr>
-          <w:rFonts w:eastAsia="標楷體"/>
-          <w:sz w:val="20"/>
-        </w:rPr>
-        <w:t>蟻群演算法</w:t>
-      </w:r>
-      <w:proofErr w:type="gramEnd"/>
+        <w:t>基因演算法、蟻群演算法</w:t>
+      </w:r>
       <w:r>
         <w:rPr>
           <w:rFonts w:eastAsia="標楷體"/>
@@ -840,39 +769,7 @@
           <w:rFonts w:eastAsia="標楷體" w:hint="eastAsia"/>
           <w:sz w:val="20"/>
         </w:rPr>
-        <w:t>然而，在實務情境中，物流公司已建立固定主線配送架構，各路線之店</w:t>
-      </w:r>
-      <w:proofErr w:type="gramStart"/>
-      <w:r>
-        <w:rPr>
-          <w:rFonts w:eastAsia="標楷體" w:hint="eastAsia"/>
-          <w:sz w:val="20"/>
-        </w:rPr>
-        <w:t>舖</w:t>
-      </w:r>
-      <w:proofErr w:type="gramEnd"/>
-      <w:r>
-        <w:rPr>
-          <w:rFonts w:eastAsia="標楷體" w:hint="eastAsia"/>
-          <w:sz w:val="20"/>
-        </w:rPr>
-        <w:t>服務順序不可任意變動，且配送決策具有明確的階層性。當配送需求波動導致主線超載時，需在維持既有順序下進行店</w:t>
-      </w:r>
-      <w:proofErr w:type="gramStart"/>
-      <w:r>
-        <w:rPr>
-          <w:rFonts w:eastAsia="標楷體" w:hint="eastAsia"/>
-          <w:sz w:val="20"/>
-        </w:rPr>
-        <w:t>舖</w:t>
-      </w:r>
-      <w:proofErr w:type="gramEnd"/>
-      <w:r>
-        <w:rPr>
-          <w:rFonts w:eastAsia="標楷體" w:hint="eastAsia"/>
-          <w:sz w:val="20"/>
-        </w:rPr>
-        <w:t>抽取與重新分配，並規劃支援線以完成配送任務。</w:t>
+        <w:t>然而，在實務情境中，物流公司已建立固定主線配送架構，各路線之店舖服務順序不可任意變動，且配送決策具有明確的階層性。當配送需求波動導致主線超載時，需在維持既有順序下進行店舖抽取與重新分配，並規劃支援線以完成配送任務。</w:t>
       </w:r>
     </w:p>
     <w:p>
@@ -917,63 +814,22 @@
           <w:rFonts w:eastAsia="標楷體" w:hint="eastAsia"/>
           <w:sz w:val="20"/>
         </w:rPr>
-        <w:t>納入主線結構、容量限制與</w:t>
-      </w:r>
-      <w:proofErr w:type="gramStart"/>
-      <w:r>
-        <w:rPr>
-          <w:rFonts w:eastAsia="標楷體" w:hint="eastAsia"/>
-          <w:sz w:val="20"/>
-        </w:rPr>
-        <w:t>時間窗等限制</w:t>
-      </w:r>
-      <w:proofErr w:type="gramEnd"/>
-      <w:r>
-        <w:rPr>
-          <w:rFonts w:eastAsia="標楷體" w:hint="eastAsia"/>
-          <w:sz w:val="20"/>
-        </w:rPr>
-        <w:t>，</w:t>
-      </w:r>
-      <w:r>
-        <w:rPr>
-          <w:rFonts w:eastAsia="標楷體" w:hint="eastAsia"/>
-          <w:sz w:val="20"/>
-        </w:rPr>
-        <w:t>將主線店</w:t>
-      </w:r>
-      <w:proofErr w:type="gramStart"/>
-      <w:r>
-        <w:rPr>
-          <w:rFonts w:eastAsia="標楷體" w:hint="eastAsia"/>
-          <w:sz w:val="20"/>
-        </w:rPr>
-        <w:t>舖</w:t>
-      </w:r>
-      <w:proofErr w:type="gramEnd"/>
-      <w:r>
-        <w:rPr>
-          <w:rFonts w:eastAsia="標楷體" w:hint="eastAsia"/>
-          <w:sz w:val="20"/>
-        </w:rPr>
-        <w:t>抽取、</w:t>
-      </w:r>
-      <w:r>
-        <w:rPr>
-          <w:rFonts w:eastAsia="標楷體" w:hint="eastAsia"/>
-          <w:sz w:val="20"/>
-        </w:rPr>
-        <w:t>候選店</w:t>
-      </w:r>
-      <w:proofErr w:type="gramStart"/>
-      <w:r>
-        <w:rPr>
-          <w:rFonts w:eastAsia="標楷體" w:hint="eastAsia"/>
-          <w:sz w:val="20"/>
-        </w:rPr>
-        <w:t>舖</w:t>
-      </w:r>
-      <w:proofErr w:type="gramEnd"/>
+        <w:t>納入主線結構、容量限制與時間窗等限制，</w:t>
+      </w:r>
+      <w:r>
+        <w:rPr>
+          <w:rFonts w:eastAsia="標楷體" w:hint="eastAsia"/>
+          <w:sz w:val="20"/>
+        </w:rPr>
+        <w:t>將主線店舖抽取、</w:t>
+      </w:r>
+      <w:r>
+        <w:rPr>
+          <w:rFonts w:eastAsia="標楷體" w:hint="eastAsia"/>
+          <w:sz w:val="20"/>
+        </w:rPr>
+        <w:t>候選店舖</w:t>
+      </w:r>
       <w:r>
         <w:rPr>
           <w:rFonts w:eastAsia="標楷體" w:hint="eastAsia"/>
@@ -1160,23 +1016,7 @@
           <w:rFonts w:eastAsia="標楷體"/>
           <w:sz w:val="20"/>
         </w:rPr>
-        <w:t>每</w:t>
-      </w:r>
-      <w:proofErr w:type="gramStart"/>
-      <w:r>
-        <w:rPr>
-          <w:rFonts w:eastAsia="標楷體"/>
-          <w:sz w:val="20"/>
-        </w:rPr>
-        <w:t>個</w:t>
-      </w:r>
-      <w:proofErr w:type="gramEnd"/>
-      <w:r>
-        <w:rPr>
-          <w:rFonts w:eastAsia="標楷體"/>
-          <w:sz w:val="20"/>
-        </w:rPr>
-        <w:t>顧客都必須完成配送</w:t>
+        <w:t>每個顧客都必須完成配送</w:t>
       </w:r>
       <w:r>
         <w:rPr>
@@ -1245,23 +1085,7 @@
           <w:rFonts w:eastAsia="標楷體"/>
           <w:sz w:val="20"/>
         </w:rPr>
-        <w:t>每</w:t>
-      </w:r>
-      <w:proofErr w:type="gramStart"/>
-      <w:r>
-        <w:rPr>
-          <w:rFonts w:eastAsia="標楷體"/>
-          <w:sz w:val="20"/>
-        </w:rPr>
-        <w:t>個</w:t>
-      </w:r>
-      <w:proofErr w:type="gramEnd"/>
-      <w:r>
-        <w:rPr>
-          <w:rFonts w:eastAsia="標楷體"/>
-          <w:sz w:val="20"/>
-        </w:rPr>
-        <w:t>顧客僅允許被拜訪一次且僅能由一輛車負責配送</w:t>
+        <w:t>每個顧客僅允許被拜訪一次且僅能由一輛車負責配送</w:t>
       </w:r>
       <w:r>
         <w:rPr>
@@ -1476,23 +1300,7 @@
           <w:rFonts w:eastAsia="標楷體"/>
           <w:sz w:val="20"/>
         </w:rPr>
-        <w:t>加入時間窗限制，要求每</w:t>
-      </w:r>
-      <w:proofErr w:type="gramStart"/>
-      <w:r>
-        <w:rPr>
-          <w:rFonts w:eastAsia="標楷體"/>
-          <w:sz w:val="20"/>
-        </w:rPr>
-        <w:t>個</w:t>
-      </w:r>
-      <w:proofErr w:type="gramEnd"/>
-      <w:r>
-        <w:rPr>
-          <w:rFonts w:eastAsia="標楷體"/>
-          <w:sz w:val="20"/>
-        </w:rPr>
-        <w:t>顧客必須於指定時間區間內接受服務，</w:t>
+        <w:t>加入時間窗限制，要求每個顧客必須於指定時間區間內接受服務，</w:t>
       </w:r>
       <w:r>
         <w:rPr>
@@ -1618,23 +1426,7 @@
           <w:rFonts w:eastAsia="標楷體"/>
           <w:sz w:val="20"/>
         </w:rPr>
-        <w:t>以最小</w:t>
-      </w:r>
-      <w:proofErr w:type="gramStart"/>
-      <w:r>
-        <w:rPr>
-          <w:rFonts w:eastAsia="標楷體"/>
-          <w:sz w:val="20"/>
-        </w:rPr>
-        <w:t>化總物流</w:t>
-      </w:r>
-      <w:proofErr w:type="gramEnd"/>
-      <w:r>
-        <w:rPr>
-          <w:rFonts w:eastAsia="標楷體"/>
-          <w:sz w:val="20"/>
-        </w:rPr>
-        <w:t>成本。</w:t>
+        <w:t>以最小化總物流成本。</w:t>
       </w:r>
     </w:p>
     <w:p>
@@ -1765,23 +1557,7 @@
           <w:rFonts w:eastAsia="標楷體"/>
           <w:sz w:val="20"/>
         </w:rPr>
-        <w:t>每</w:t>
-      </w:r>
-      <w:proofErr w:type="gramStart"/>
-      <w:r>
-        <w:rPr>
-          <w:rFonts w:eastAsia="標楷體"/>
-          <w:sz w:val="20"/>
-        </w:rPr>
-        <w:t>個</w:t>
-      </w:r>
-      <w:proofErr w:type="gramEnd"/>
-      <w:r>
-        <w:rPr>
-          <w:rFonts w:eastAsia="標楷體"/>
-          <w:sz w:val="20"/>
-        </w:rPr>
-        <w:t>候選解稱為個體</w:t>
+        <w:t>每個候選解稱為個體</w:t>
       </w:r>
       <w:r>
         <w:rPr>
@@ -1865,23 +1641,7 @@
           <w:rFonts w:eastAsia="標楷體"/>
           <w:sz w:val="20"/>
         </w:rPr>
-        <w:t>，</w:t>
-      </w:r>
-      <w:proofErr w:type="gramStart"/>
-      <w:r>
-        <w:rPr>
-          <w:rFonts w:eastAsia="標楷體"/>
-          <w:sz w:val="20"/>
-        </w:rPr>
-        <w:t>使較高</w:t>
-      </w:r>
-      <w:proofErr w:type="gramEnd"/>
-      <w:r>
-        <w:rPr>
-          <w:rFonts w:eastAsia="標楷體"/>
-          <w:sz w:val="20"/>
-        </w:rPr>
-        <w:t>適應值的個體在演化過程中更容易被保留，逐步產生更優質的解。</w:t>
+        <w:t>，使較高適應值的個體在演化過程中更容易被保留，逐步產生更優質的解。</w:t>
       </w:r>
     </w:p>
     <w:p>
@@ -2103,23 +1863,7 @@
           <w:rFonts w:eastAsia="標楷體"/>
           <w:sz w:val="20"/>
         </w:rPr>
-        <w:t>以提升</w:t>
-      </w:r>
-      <w:proofErr w:type="gramStart"/>
-      <w:r>
-        <w:rPr>
-          <w:rFonts w:eastAsia="標楷體"/>
-          <w:sz w:val="20"/>
-        </w:rPr>
-        <w:t>初始解的</w:t>
-      </w:r>
-      <w:proofErr w:type="gramEnd"/>
-      <w:r>
-        <w:rPr>
-          <w:rFonts w:eastAsia="標楷體"/>
-          <w:sz w:val="20"/>
-        </w:rPr>
-        <w:t>品質與多樣性</w:t>
+        <w:t>以提升初始解的品質與多樣性</w:t>
       </w:r>
       <w:r>
         <w:rPr>
@@ -2153,7 +1897,6 @@
           <w:sz w:val="20"/>
         </w:rPr>
       </w:pPr>
-      <w:proofErr w:type="gramStart"/>
       <w:r>
         <w:rPr>
           <w:rFonts w:eastAsia="標楷體" w:hint="eastAsia"/>
@@ -2166,15 +1909,7 @@
           <w:rFonts w:eastAsia="標楷體"/>
           <w:sz w:val="20"/>
         </w:rPr>
-        <w:t>針對高維度且具子</w:t>
-      </w:r>
-      <w:proofErr w:type="gramEnd"/>
-      <w:r>
-        <w:rPr>
-          <w:rFonts w:eastAsia="標楷體"/>
-          <w:sz w:val="20"/>
-        </w:rPr>
-        <w:t>問題相依性之問題，合作式共同演化基因演算法</w:t>
+        <w:t>針對高維度且具子問題相依性之問題，合作式共同演化基因演算法</w:t>
       </w:r>
       <w:r>
         <w:rPr>
@@ -2315,7 +2050,6 @@
           <w:sz w:val="20"/>
         </w:rPr>
       </w:pPr>
-      <w:proofErr w:type="gramStart"/>
       <w:r>
         <w:rPr>
           <w:rFonts w:eastAsia="標楷體" w:hint="eastAsia"/>
@@ -2328,15 +2062,7 @@
           <w:rFonts w:eastAsia="標楷體" w:hint="eastAsia"/>
           <w:sz w:val="20"/>
         </w:rPr>
-        <w:t>法</w:t>
-      </w:r>
-      <w:proofErr w:type="gramEnd"/>
-      <w:r>
-        <w:rPr>
-          <w:rFonts w:eastAsia="標楷體" w:hint="eastAsia"/>
-          <w:sz w:val="20"/>
-        </w:rPr>
-        <w:t>為</w:t>
+        <w:t>法為</w:t>
       </w:r>
       <w:r>
         <w:rPr>
@@ -2385,23 +2111,7 @@
           <w:rFonts w:eastAsia="標楷體"/>
           <w:sz w:val="20"/>
         </w:rPr>
-        <w:t>每</w:t>
-      </w:r>
-      <w:proofErr w:type="gramStart"/>
-      <w:r>
-        <w:rPr>
-          <w:rFonts w:eastAsia="標楷體"/>
-          <w:sz w:val="20"/>
-        </w:rPr>
-        <w:t>隻螞蟻</w:t>
-      </w:r>
-      <w:proofErr w:type="gramEnd"/>
-      <w:r>
-        <w:rPr>
-          <w:rFonts w:eastAsia="標楷體"/>
-          <w:sz w:val="20"/>
-        </w:rPr>
-        <w:t>以輪盤選擇法選擇下一個節點，選擇機率根據當前路徑的費洛蒙濃度與啟發式信息決定，此決策機制屬於序列式決策</w:t>
+        <w:t>每隻螞蟻以輪盤選擇法選擇下一個節點，選擇機率根據當前路徑的費洛蒙濃度與啟發式信息決定，此決策機制屬於序列式決策</w:t>
       </w:r>
       <w:r>
         <w:rPr>
@@ -2517,23 +2227,7 @@
           <w:rFonts w:eastAsia="標楷體"/>
           <w:sz w:val="20"/>
         </w:rPr>
-        <w:t>，採用</w:t>
-      </w:r>
-      <w:proofErr w:type="gramStart"/>
-      <w:r>
-        <w:rPr>
-          <w:rFonts w:eastAsia="標楷體"/>
-          <w:sz w:val="20"/>
-        </w:rPr>
-        <w:t>雙蟻群協作</w:t>
-      </w:r>
-      <w:proofErr w:type="gramEnd"/>
-      <w:r>
-        <w:rPr>
-          <w:rFonts w:eastAsia="標楷體"/>
-          <w:sz w:val="20"/>
-        </w:rPr>
-        <w:t>架構，分別最佳化車輛數量與總行駛距離，透過費洛蒙資訊交換實現多目標協同搜尋。</w:t>
+        <w:t>，採用雙蟻群協作架構，分別最佳化車輛數量與總行駛距離，透過費洛蒙資訊交換實現多目標協同搜尋。</w:t>
       </w:r>
       <w:r>
         <w:rPr>
@@ -2590,23 +2284,7 @@
           <w:rFonts w:eastAsia="標楷體"/>
           <w:sz w:val="20"/>
         </w:rPr>
-        <w:t>則進一步將</w:t>
-      </w:r>
-      <w:proofErr w:type="gramStart"/>
-      <w:r>
-        <w:rPr>
-          <w:rFonts w:eastAsia="標楷體"/>
-          <w:sz w:val="20"/>
-        </w:rPr>
-        <w:t>多蟻群架構</w:t>
-      </w:r>
-      <w:proofErr w:type="gramEnd"/>
-      <w:r>
-        <w:rPr>
-          <w:rFonts w:eastAsia="標楷體"/>
-          <w:sz w:val="20"/>
-        </w:rPr>
-        <w:t>應用於</w:t>
+        <w:t>則進一步將多蟻群架構應用於</w:t>
       </w:r>
       <w:r>
         <w:rPr>
@@ -2721,23 +2399,7 @@
           <w:rFonts w:eastAsia="標楷體"/>
           <w:sz w:val="20"/>
         </w:rPr>
-        <w:t>之混合式方法，並結合</w:t>
-      </w:r>
-      <w:proofErr w:type="gramStart"/>
-      <w:r>
-        <w:rPr>
-          <w:rFonts w:eastAsia="標楷體"/>
-          <w:sz w:val="20"/>
-        </w:rPr>
-        <w:t>變動鄰域禁忌</w:t>
-      </w:r>
-      <w:proofErr w:type="gramEnd"/>
-      <w:r>
-        <w:rPr>
-          <w:rFonts w:eastAsia="標楷體"/>
-          <w:sz w:val="20"/>
-        </w:rPr>
-        <w:t>搜尋</w:t>
+        <w:t>之混合式方法，並結合變動鄰域禁忌搜尋</w:t>
       </w:r>
       <w:r>
         <w:rPr>
@@ -2849,21 +2511,12 @@
         </w:rPr>
         <w:t>在本研究之</w:t>
       </w:r>
-      <w:proofErr w:type="gramStart"/>
-      <w:r>
-        <w:rPr>
-          <w:rFonts w:eastAsia="標楷體"/>
-          <w:sz w:val="20"/>
-        </w:rPr>
-        <w:t>實際物流場</w:t>
-      </w:r>
-      <w:proofErr w:type="gramEnd"/>
-      <w:r>
-        <w:rPr>
-          <w:rFonts w:eastAsia="標楷體"/>
-          <w:sz w:val="20"/>
-        </w:rPr>
-        <w:t>域中，</w:t>
+      <w:r>
+        <w:rPr>
+          <w:rFonts w:eastAsia="標楷體"/>
+          <w:sz w:val="20"/>
+        </w:rPr>
+        <w:t>實際物流場域中，</w:t>
       </w:r>
       <w:r>
         <w:rPr>
@@ -2891,23 +2544,7 @@
           <w:rFonts w:eastAsia="標楷體"/>
           <w:sz w:val="20"/>
         </w:rPr>
-        <w:t>架構，店</w:t>
-      </w:r>
-      <w:proofErr w:type="gramStart"/>
-      <w:r>
-        <w:rPr>
-          <w:rFonts w:eastAsia="標楷體"/>
-          <w:sz w:val="20"/>
-        </w:rPr>
-        <w:t>舖</w:t>
-      </w:r>
-      <w:proofErr w:type="gramEnd"/>
-      <w:r>
-        <w:rPr>
-          <w:rFonts w:eastAsia="標楷體"/>
-          <w:sz w:val="20"/>
-        </w:rPr>
-        <w:t>服務順序具穩定性，</w:t>
+        <w:t>架構，店舖服務順序具穩定性，</w:t>
       </w:r>
       <w:r>
         <w:rPr>
@@ -3163,23 +2800,7 @@
           <w:rFonts w:eastAsia="標楷體"/>
           <w:sz w:val="20"/>
         </w:rPr>
-        <w:t>該資料為物流公司依據以往配送經驗所規劃的主線配送路線，即車輛行駛路線與配送順序的初步規劃。本研究旨在解決在已有主線配送、材積量以及時間窗限制的條件下，重新規劃支援線的配送問題。由於每日各店</w:t>
-      </w:r>
-      <w:proofErr w:type="gramStart"/>
-      <w:r>
-        <w:rPr>
-          <w:rFonts w:eastAsia="標楷體"/>
-          <w:sz w:val="20"/>
-        </w:rPr>
-        <w:t>舖</w:t>
-      </w:r>
-      <w:proofErr w:type="gramEnd"/>
-      <w:r>
-        <w:rPr>
-          <w:rFonts w:eastAsia="標楷體"/>
-          <w:sz w:val="20"/>
-        </w:rPr>
-        <w:t>的實際配送需求可能變動，因此當主線配送車輛無法滿足所有需求，便需要調整配送策略，以避免延誤且提升整體效率。</w:t>
+        <w:t>該資料為物流公司依據以往配送經驗所規劃的主線配送路線，即車輛行駛路線與配送順序的初步規劃。本研究旨在解決在已有主線配送、材積量以及時間窗限制的條件下，重新規劃支援線的配送問題。由於每日各店舖的實際配送需求可能變動，因此當主線配送車輛無法滿足所有需求，便需要調整配送策略，以避免延誤且提升整體效率。</w:t>
       </w:r>
     </w:p>
     <w:p>
@@ -3293,39 +2914,7 @@
           <w:rFonts w:eastAsia="標楷體"/>
           <w:sz w:val="20"/>
         </w:rPr>
-        <w:t>店</w:t>
-      </w:r>
-      <w:proofErr w:type="gramStart"/>
-      <w:r>
-        <w:rPr>
-          <w:rFonts w:eastAsia="標楷體"/>
-          <w:sz w:val="20"/>
-        </w:rPr>
-        <w:t>舖</w:t>
-      </w:r>
-      <w:proofErr w:type="gramEnd"/>
-      <w:r>
-        <w:rPr>
-          <w:rFonts w:eastAsia="標楷體"/>
-          <w:sz w:val="20"/>
-        </w:rPr>
-        <w:t>配送需要符合時間窗限制，到店時間</w:t>
-      </w:r>
-      <w:proofErr w:type="gramStart"/>
-      <w:r>
-        <w:rPr>
-          <w:rFonts w:eastAsia="標楷體"/>
-          <w:sz w:val="20"/>
-        </w:rPr>
-        <w:t>應於表定</w:t>
-      </w:r>
-      <w:proofErr w:type="gramEnd"/>
-      <w:r>
-        <w:rPr>
-          <w:rFonts w:eastAsia="標楷體"/>
-          <w:sz w:val="20"/>
-        </w:rPr>
-        <w:t>前一小時至後三十分鐘內</w:t>
+        <w:t>店舖配送需要符合時間窗限制，到店時間應於表定前一小時至後三十分鐘內</w:t>
       </w:r>
       <w:r>
         <w:rPr>
@@ -3394,39 +2983,7 @@
           <w:rFonts w:eastAsia="標楷體"/>
           <w:sz w:val="20"/>
         </w:rPr>
-        <w:t>主線可以支援運送支援候選店</w:t>
-      </w:r>
-      <w:proofErr w:type="gramStart"/>
-      <w:r>
-        <w:rPr>
-          <w:rFonts w:eastAsia="標楷體"/>
-          <w:sz w:val="20"/>
-        </w:rPr>
-        <w:t>舖</w:t>
-      </w:r>
-      <w:proofErr w:type="gramEnd"/>
-      <w:r>
-        <w:rPr>
-          <w:rFonts w:eastAsia="標楷體"/>
-          <w:sz w:val="20"/>
-        </w:rPr>
-        <w:t>，但原店</w:t>
-      </w:r>
-      <w:proofErr w:type="gramStart"/>
-      <w:r>
-        <w:rPr>
-          <w:rFonts w:eastAsia="標楷體"/>
-          <w:sz w:val="20"/>
-        </w:rPr>
-        <w:t>舖</w:t>
-      </w:r>
-      <w:proofErr w:type="gramEnd"/>
-      <w:r>
-        <w:rPr>
-          <w:rFonts w:eastAsia="標楷體"/>
-          <w:sz w:val="20"/>
-        </w:rPr>
-        <w:t>配送順序不能調整</w:t>
+        <w:t>主線可以支援運送支援候選店舖，但原店舖配送順序不能調整</w:t>
       </w:r>
       <w:r>
         <w:rPr>
@@ -3464,23 +3021,7 @@
           <w:rFonts w:eastAsia="標楷體"/>
           <w:sz w:val="20"/>
         </w:rPr>
-        <w:t>支援路線規劃，先依照地理位置分群，由最遠的店</w:t>
-      </w:r>
-      <w:proofErr w:type="gramStart"/>
-      <w:r>
-        <w:rPr>
-          <w:rFonts w:eastAsia="標楷體"/>
-          <w:sz w:val="20"/>
-        </w:rPr>
-        <w:t>舖</w:t>
-      </w:r>
-      <w:proofErr w:type="gramEnd"/>
-      <w:r>
-        <w:rPr>
-          <w:rFonts w:eastAsia="標楷體"/>
-          <w:sz w:val="20"/>
-        </w:rPr>
-        <w:t>先進行配送</w:t>
+        <w:t>支援路線規劃，先依照地理位置分群，由最遠的店舖先進行配送</w:t>
       </w:r>
       <w:r>
         <w:rPr>
@@ -3518,119 +3059,7 @@
           <w:rFonts w:eastAsia="標楷體"/>
           <w:sz w:val="20"/>
         </w:rPr>
-        <w:t>店</w:t>
-      </w:r>
-      <w:proofErr w:type="gramStart"/>
-      <w:r>
-        <w:rPr>
-          <w:rFonts w:eastAsia="標楷體"/>
-          <w:sz w:val="20"/>
-        </w:rPr>
-        <w:t>舖</w:t>
-      </w:r>
-      <w:proofErr w:type="gramEnd"/>
-      <w:r>
-        <w:rPr>
-          <w:rFonts w:eastAsia="標楷體"/>
-          <w:sz w:val="20"/>
-        </w:rPr>
-        <w:t>分為近、中和</w:t>
-      </w:r>
-      <w:proofErr w:type="gramStart"/>
-      <w:r>
-        <w:rPr>
-          <w:rFonts w:eastAsia="標楷體"/>
-          <w:sz w:val="20"/>
-        </w:rPr>
-        <w:t>遠區，近區</w:t>
-      </w:r>
-      <w:proofErr w:type="gramEnd"/>
-      <w:r>
-        <w:rPr>
-          <w:rFonts w:eastAsia="標楷體"/>
-          <w:sz w:val="20"/>
-        </w:rPr>
-        <w:t>與中區店</w:t>
-      </w:r>
-      <w:proofErr w:type="gramStart"/>
-      <w:r>
-        <w:rPr>
-          <w:rFonts w:eastAsia="標楷體"/>
-          <w:sz w:val="20"/>
-        </w:rPr>
-        <w:t>舖</w:t>
-      </w:r>
-      <w:proofErr w:type="gramEnd"/>
-      <w:r>
-        <w:rPr>
-          <w:rFonts w:eastAsia="標楷體"/>
-          <w:sz w:val="20"/>
-        </w:rPr>
-        <w:t>無需考慮方向問題，</w:t>
-      </w:r>
-      <w:proofErr w:type="gramStart"/>
-      <w:r>
-        <w:rPr>
-          <w:rFonts w:eastAsia="標楷體"/>
-          <w:sz w:val="20"/>
-        </w:rPr>
-        <w:t>遠區店舖</w:t>
-      </w:r>
-      <w:proofErr w:type="gramEnd"/>
-      <w:r>
-        <w:rPr>
-          <w:rFonts w:eastAsia="標楷體"/>
-          <w:sz w:val="20"/>
-        </w:rPr>
-        <w:t>若第一間店</w:t>
-      </w:r>
-      <w:proofErr w:type="gramStart"/>
-      <w:r>
-        <w:rPr>
-          <w:rFonts w:eastAsia="標楷體"/>
-          <w:sz w:val="20"/>
-        </w:rPr>
-        <w:t>舖</w:t>
-      </w:r>
-      <w:proofErr w:type="gramEnd"/>
-      <w:r>
-        <w:rPr>
-          <w:rFonts w:eastAsia="標楷體"/>
-          <w:sz w:val="20"/>
-        </w:rPr>
-        <w:t>已挑選物流中心以北的店</w:t>
-      </w:r>
-      <w:proofErr w:type="gramStart"/>
-      <w:r>
-        <w:rPr>
-          <w:rFonts w:eastAsia="標楷體"/>
-          <w:sz w:val="20"/>
-        </w:rPr>
-        <w:t>舖</w:t>
-      </w:r>
-      <w:proofErr w:type="gramEnd"/>
-      <w:r>
-        <w:rPr>
-          <w:rFonts w:eastAsia="標楷體"/>
-          <w:sz w:val="20"/>
-        </w:rPr>
-        <w:t>，後續不得挑選物流中心以南的店</w:t>
-      </w:r>
-      <w:proofErr w:type="gramStart"/>
-      <w:r>
-        <w:rPr>
-          <w:rFonts w:eastAsia="標楷體"/>
-          <w:sz w:val="20"/>
-        </w:rPr>
-        <w:t>舖</w:t>
-      </w:r>
-      <w:proofErr w:type="gramEnd"/>
-      <w:r>
-        <w:rPr>
-          <w:rFonts w:eastAsia="標楷體"/>
-          <w:sz w:val="20"/>
-        </w:rPr>
-        <w:t>，東西向亦然</w:t>
+        <w:t>店舖分為近、中和遠區，近區與中區店舖無需考慮方向問題，遠區店舖若第一間店舖已挑選物流中心以北的店舖，後續不得挑選物流中心以南的店舖，東西向亦然</w:t>
       </w:r>
       <w:r>
         <w:rPr>
@@ -4076,7 +3505,6 @@
         </w:rPr>
         <w:t>是否從店鋪</w:t>
       </w:r>
-      <w:proofErr w:type="spellStart"/>
       <w:r>
         <w:rPr>
           <w:rFonts w:eastAsia="標楷體" w:hint="eastAsia"/>
@@ -4084,7 +3512,6 @@
         </w:rPr>
         <w:t>i</w:t>
       </w:r>
-      <w:proofErr w:type="spellEnd"/>
       <w:r>
         <w:rPr>
           <w:rFonts w:eastAsia="標楷體" w:hint="eastAsia"/>
@@ -4169,7 +3596,25 @@
                       <w:color w:val="auto"/>
                       <w:sz w:val="20"/>
                     </w:rPr>
-                    <m:t>vehicle</m:t>
+                    <m:t>ve</m:t>
+                  </m:r>
+                  <m:r>
+                    <w:rPr>
+                      <w:rStyle w:val="af"/>
+                      <w:rFonts w:ascii="Cambria Math" w:hAnsi="Cambria Math"/>
+                      <w:color w:val="auto"/>
+                      <w:sz w:val="20"/>
+                    </w:rPr>
+                    <m:t>h</m:t>
+                  </m:r>
+                  <m:r>
+                    <w:rPr>
+                      <w:rStyle w:val="af"/>
+                      <w:rFonts w:ascii="Cambria Math" w:hAnsi="Cambria Math"/>
+                      <w:color w:val="auto"/>
+                      <w:sz w:val="20"/>
+                    </w:rPr>
+                    <m:t>icle</m:t>
                   </m:r>
                 </m:sub>
               </m:sSub>
@@ -4225,7 +3670,14 @@
                       <w:rFonts w:ascii="Cambria Math" w:eastAsia="標楷體" w:hAnsi="Cambria Math"/>
                       <w:sz w:val="20"/>
                     </w:rPr>
-                    <m:t>h∈H</m:t>
+                    <m:t>h∈</m:t>
+                  </m:r>
+                  <m:r>
+                    <w:rPr>
+                      <w:rFonts w:ascii="Cambria Math" w:eastAsia="標楷體" w:hAnsi="Cambria Math"/>
+                      <w:sz w:val="20"/>
+                    </w:rPr>
+                    <m:t>H</m:t>
                   </m:r>
                 </m:sub>
                 <m:sup/>
@@ -4259,7 +3711,21 @@
                               <w:rFonts w:ascii="Cambria Math" w:eastAsia="標楷體" w:hAnsi="Cambria Math"/>
                               <w:sz w:val="20"/>
                             </w:rPr>
-                            <m:t>j∈N</m:t>
+                            <m:t>j</m:t>
+                          </m:r>
+                          <m:r>
+                            <w:rPr>
+                              <w:rFonts w:ascii="Cambria Math" w:eastAsia="標楷體" w:hAnsi="Cambria Math"/>
+                              <w:sz w:val="20"/>
+                            </w:rPr>
+                            <m:t>∈</m:t>
+                          </m:r>
+                          <m:r>
+                            <w:rPr>
+                              <w:rFonts w:ascii="Cambria Math" w:eastAsia="標楷體" w:hAnsi="Cambria Math"/>
+                              <w:sz w:val="20"/>
+                            </w:rPr>
+                            <m:t>N</m:t>
                           </m:r>
                         </m:e>
                         <m:e>
@@ -4268,7 +3734,21 @@
                               <w:rFonts w:ascii="Cambria Math" w:eastAsia="標楷體" w:hAnsi="Cambria Math"/>
                               <w:sz w:val="20"/>
                             </w:rPr>
-                            <m:t>(j≠0)</m:t>
+                            <m:t>(</m:t>
+                          </m:r>
+                          <m:r>
+                            <w:rPr>
+                              <w:rFonts w:ascii="Cambria Math" w:eastAsia="標楷體" w:hAnsi="Cambria Math"/>
+                              <w:sz w:val="20"/>
+                            </w:rPr>
+                            <m:t>j</m:t>
+                          </m:r>
+                          <m:r>
+                            <w:rPr>
+                              <w:rFonts w:ascii="Cambria Math" w:eastAsia="標楷體" w:hAnsi="Cambria Math"/>
+                              <w:sz w:val="20"/>
+                            </w:rPr>
+                            <m:t>≠0)</m:t>
                           </m:r>
                         </m:e>
                       </m:eqArr>
@@ -4300,7 +3780,14 @@
                               <w:rFonts w:ascii="Cambria Math" w:eastAsia="標楷體" w:hAnsi="Cambria Math"/>
                               <w:sz w:val="20"/>
                             </w:rPr>
-                            <m:t>0,j</m:t>
+                            <m:t>0,</m:t>
+                          </m:r>
+                          <m:r>
+                            <w:rPr>
+                              <w:rFonts w:ascii="Cambria Math" w:eastAsia="標楷體" w:hAnsi="Cambria Math"/>
+                              <w:sz w:val="20"/>
+                            </w:rPr>
+                            <m:t>j</m:t>
                           </m:r>
                         </m:sub>
                         <m:sup>
@@ -4457,7 +3944,21 @@
                       <w:rFonts w:ascii="Cambria Math" w:eastAsia="標楷體" w:hAnsi="Cambria Math"/>
                       <w:sz w:val="20"/>
                     </w:rPr>
-                    <m:t>k∈K</m:t>
+                    <m:t>k</m:t>
+                  </m:r>
+                  <m:r>
+                    <w:rPr>
+                      <w:rFonts w:ascii="Cambria Math" w:eastAsia="標楷體" w:hAnsi="Cambria Math"/>
+                      <w:sz w:val="20"/>
+                    </w:rPr>
+                    <m:t>∈</m:t>
+                  </m:r>
+                  <m:r>
+                    <w:rPr>
+                      <w:rFonts w:ascii="Cambria Math" w:eastAsia="標楷體" w:hAnsi="Cambria Math"/>
+                      <w:sz w:val="20"/>
+                    </w:rPr>
+                    <m:t>K</m:t>
                   </m:r>
                 </m:sub>
                 <m:sup/>
@@ -4480,7 +3981,14 @@
                           <w:rFonts w:ascii="Cambria Math" w:eastAsia="標楷體" w:hAnsi="Cambria Math"/>
                           <w:sz w:val="20"/>
                         </w:rPr>
-                        <m:t>i∈</m:t>
+                        <m:t>i</m:t>
+                      </m:r>
+                      <m:r>
+                        <w:rPr>
+                          <w:rFonts w:ascii="Cambria Math" w:eastAsia="標楷體" w:hAnsi="Cambria Math"/>
+                          <w:sz w:val="20"/>
+                        </w:rPr>
+                        <m:t>∈</m:t>
                       </m:r>
                       <m:r>
                         <w:rPr>
@@ -4521,7 +4029,14 @@
                                   <w:rFonts w:ascii="Cambria Math" w:eastAsia="標楷體" w:hAnsi="Cambria Math"/>
                                   <w:sz w:val="20"/>
                                 </w:rPr>
-                                <m:t>j∈</m:t>
+                                <m:t>j</m:t>
+                              </m:r>
+                              <m:r>
+                                <w:rPr>
+                                  <w:rFonts w:ascii="Cambria Math" w:eastAsia="標楷體" w:hAnsi="Cambria Math"/>
+                                  <w:sz w:val="20"/>
+                                </w:rPr>
+                                <m:t>∈</m:t>
                               </m:r>
                               <m:r>
                                 <w:rPr>
@@ -4537,7 +4052,35 @@
                                   <w:rFonts w:ascii="Cambria Math" w:eastAsia="標楷體" w:hAnsi="Cambria Math"/>
                                   <w:sz w:val="20"/>
                                 </w:rPr>
-                                <m:t>(j≠i)</m:t>
+                                <m:t>(</m:t>
+                              </m:r>
+                              <m:r>
+                                <w:rPr>
+                                  <w:rFonts w:ascii="Cambria Math" w:eastAsia="標楷體" w:hAnsi="Cambria Math"/>
+                                  <w:sz w:val="20"/>
+                                </w:rPr>
+                                <m:t>j</m:t>
+                              </m:r>
+                              <m:r>
+                                <w:rPr>
+                                  <w:rFonts w:ascii="Cambria Math" w:eastAsia="標楷體" w:hAnsi="Cambria Math"/>
+                                  <w:sz w:val="20"/>
+                                </w:rPr>
+                                <m:t>≠</m:t>
+                              </m:r>
+                              <m:r>
+                                <w:rPr>
+                                  <w:rFonts w:ascii="Cambria Math" w:eastAsia="標楷體" w:hAnsi="Cambria Math"/>
+                                  <w:sz w:val="20"/>
+                                </w:rPr>
+                                <m:t>i</m:t>
+                              </m:r>
+                              <m:r>
+                                <w:rPr>
+                                  <w:rFonts w:ascii="Cambria Math" w:eastAsia="標楷體" w:hAnsi="Cambria Math"/>
+                                  <w:sz w:val="20"/>
+                                </w:rPr>
+                                <m:t>)</m:t>
                               </m:r>
                             </m:e>
                           </m:eqArr>
@@ -4569,7 +4112,21 @@
                                   <w:rFonts w:ascii="Cambria Math" w:eastAsia="標楷體" w:hAnsi="Cambria Math"/>
                                   <w:sz w:val="20"/>
                                 </w:rPr>
-                                <m:t>i,j</m:t>
+                                <m:t>i</m:t>
+                              </m:r>
+                              <m:r>
+                                <w:rPr>
+                                  <w:rFonts w:ascii="Cambria Math" w:eastAsia="標楷體" w:hAnsi="Cambria Math"/>
+                                  <w:sz w:val="20"/>
+                                </w:rPr>
+                                <m:t>,</m:t>
+                              </m:r>
+                              <m:r>
+                                <w:rPr>
+                                  <w:rFonts w:ascii="Cambria Math" w:eastAsia="標楷體" w:hAnsi="Cambria Math"/>
+                                  <w:sz w:val="20"/>
+                                </w:rPr>
+                                <m:t>j</m:t>
                               </m:r>
                             </m:sub>
                           </m:sSub>
@@ -4605,7 +4162,21 @@
                                   <w:rFonts w:ascii="Cambria Math" w:eastAsia="標楷體" w:hAnsi="Cambria Math"/>
                                   <w:sz w:val="20"/>
                                 </w:rPr>
-                                <m:t>i,j</m:t>
+                                <m:t>i</m:t>
+                              </m:r>
+                              <m:r>
+                                <w:rPr>
+                                  <w:rFonts w:ascii="Cambria Math" w:eastAsia="標楷體" w:hAnsi="Cambria Math"/>
+                                  <w:sz w:val="20"/>
+                                </w:rPr>
+                                <m:t>,</m:t>
+                              </m:r>
+                              <m:r>
+                                <w:rPr>
+                                  <w:rFonts w:ascii="Cambria Math" w:eastAsia="標楷體" w:hAnsi="Cambria Math"/>
+                                  <w:sz w:val="20"/>
+                                </w:rPr>
+                                <m:t>j</m:t>
                               </m:r>
                             </m:sub>
                             <m:sup>
@@ -4938,39 +4509,7 @@
           <w:sz w:val="20"/>
         </w:rPr>
         <w:lastRenderedPageBreak/>
-        <w:t>送店</w:t>
-      </w:r>
-      <w:proofErr w:type="gramStart"/>
-      <w:r>
-        <w:rPr>
-          <w:rFonts w:eastAsia="標楷體"/>
-          <w:sz w:val="20"/>
-        </w:rPr>
-        <w:t>舖</w:t>
-      </w:r>
-      <w:proofErr w:type="gramEnd"/>
-      <w:r>
-        <w:rPr>
-          <w:rFonts w:eastAsia="標楷體"/>
-          <w:sz w:val="20"/>
-        </w:rPr>
-        <w:t>之間的距離矩陣，提供路線規劃所需之行駛距離資訊。在路線模組中，透過店</w:t>
-      </w:r>
-      <w:proofErr w:type="gramStart"/>
-      <w:r>
-        <w:rPr>
-          <w:rFonts w:eastAsia="標楷體"/>
-          <w:sz w:val="20"/>
-        </w:rPr>
-        <w:t>舖</w:t>
-      </w:r>
-      <w:proofErr w:type="gramEnd"/>
-      <w:r>
-        <w:rPr>
-          <w:rFonts w:eastAsia="標楷體"/>
-          <w:sz w:val="20"/>
-        </w:rPr>
-        <w:t>抽取</w:t>
+        <w:t>送店舖之間的距離矩陣，提供路線規劃所需之行駛距離資訊。在路線模組中，透過店舖抽取</w:t>
       </w:r>
       <w:r>
         <w:rPr>
@@ -4984,55 +4523,7 @@
           <w:rFonts w:eastAsia="標楷體"/>
           <w:sz w:val="20"/>
         </w:rPr>
-        <w:t>將超出承載限制之主線店</w:t>
-      </w:r>
-      <w:proofErr w:type="gramStart"/>
-      <w:r>
-        <w:rPr>
-          <w:rFonts w:eastAsia="標楷體"/>
-          <w:sz w:val="20"/>
-        </w:rPr>
-        <w:t>舖</w:t>
-      </w:r>
-      <w:proofErr w:type="gramEnd"/>
-      <w:r>
-        <w:rPr>
-          <w:rFonts w:eastAsia="標楷體"/>
-          <w:sz w:val="20"/>
-        </w:rPr>
-        <w:t>進行篩選，並形成候選店</w:t>
-      </w:r>
-      <w:proofErr w:type="gramStart"/>
-      <w:r>
-        <w:rPr>
-          <w:rFonts w:eastAsia="標楷體"/>
-          <w:sz w:val="20"/>
-        </w:rPr>
-        <w:t>舖</w:t>
-      </w:r>
-      <w:proofErr w:type="gramEnd"/>
-      <w:r>
-        <w:rPr>
-          <w:rFonts w:eastAsia="標楷體"/>
-          <w:sz w:val="20"/>
-        </w:rPr>
-        <w:t>集合，後續再根據候選店</w:t>
-      </w:r>
-      <w:proofErr w:type="gramStart"/>
-      <w:r>
-        <w:rPr>
-          <w:rFonts w:eastAsia="標楷體"/>
-          <w:sz w:val="20"/>
-        </w:rPr>
-        <w:t>舖</w:t>
-      </w:r>
-      <w:proofErr w:type="gramEnd"/>
-      <w:r>
-        <w:rPr>
-          <w:rFonts w:eastAsia="標楷體"/>
-          <w:sz w:val="20"/>
-        </w:rPr>
-        <w:t>分配</w:t>
+        <w:t>將超出承載限制之主線店舖進行篩選，並形成候選店舖集合，後續再根據候選店舖分配</w:t>
       </w:r>
       <w:r>
         <w:rPr>
@@ -5060,23 +4551,7 @@
           <w:rFonts w:eastAsia="標楷體"/>
           <w:sz w:val="20"/>
         </w:rPr>
-        <w:t>將候選店</w:t>
-      </w:r>
-      <w:proofErr w:type="gramStart"/>
-      <w:r>
-        <w:rPr>
-          <w:rFonts w:eastAsia="標楷體"/>
-          <w:sz w:val="20"/>
-        </w:rPr>
-        <w:t>舖</w:t>
-      </w:r>
-      <w:proofErr w:type="gramEnd"/>
-      <w:r>
-        <w:rPr>
-          <w:rFonts w:eastAsia="標楷體"/>
-          <w:sz w:val="20"/>
-        </w:rPr>
-        <w:t>重新分配至主線或支援線並結合</w:t>
+        <w:t>將候選店舖重新分配至主線或支援線並結合</w:t>
       </w:r>
       <w:r>
         <w:rPr>
@@ -5326,39 +4801,7 @@
           <w:rFonts w:eastAsia="標楷體" w:hint="eastAsia"/>
           <w:sz w:val="20"/>
         </w:rPr>
-        <w:t>針對原始取得相關資料進行彙整、轉換與清理，以建立後續自動化路線編排流程所需之結構化資料集。相關資料包含路網資料、各</w:t>
-      </w:r>
-      <w:proofErr w:type="gramStart"/>
-      <w:r>
-        <w:rPr>
-          <w:rFonts w:eastAsia="標楷體" w:hint="eastAsia"/>
-          <w:sz w:val="20"/>
-        </w:rPr>
-        <w:t>店滯店</w:t>
-      </w:r>
-      <w:proofErr w:type="gramEnd"/>
-      <w:r>
-        <w:rPr>
-          <w:rFonts w:eastAsia="標楷體" w:hint="eastAsia"/>
-          <w:sz w:val="20"/>
-        </w:rPr>
-        <w:t>時間、店</w:t>
-      </w:r>
-      <w:proofErr w:type="gramStart"/>
-      <w:r>
-        <w:rPr>
-          <w:rFonts w:eastAsia="標楷體" w:hint="eastAsia"/>
-          <w:sz w:val="20"/>
-        </w:rPr>
-        <w:t>舖</w:t>
-      </w:r>
-      <w:proofErr w:type="gramEnd"/>
-      <w:r>
-        <w:rPr>
-          <w:rFonts w:eastAsia="標楷體" w:hint="eastAsia"/>
-          <w:sz w:val="20"/>
-        </w:rPr>
-        <w:t>主檔及既有人工編排配送路線資料。</w:t>
+        <w:t>針對原始取得相關資料進行彙整、轉換與清理，以建立後續自動化路線編排流程所需之結構化資料集。相關資料包含路網資料、各店滯店時間、店舖主檔及既有人工編排配送路線資料。</w:t>
       </w:r>
     </w:p>
     <w:p>
@@ -5375,103 +4818,7 @@
           <w:rFonts w:eastAsia="標楷體" w:hint="eastAsia"/>
           <w:sz w:val="20"/>
         </w:rPr>
-        <w:t>在資料前處理過程中，首先將資料來源進行格式統一與欄位對應，並依據路線編號與店</w:t>
-      </w:r>
-      <w:proofErr w:type="gramStart"/>
-      <w:r>
-        <w:rPr>
-          <w:rFonts w:eastAsia="標楷體" w:hint="eastAsia"/>
-          <w:sz w:val="20"/>
-        </w:rPr>
-        <w:t>舖</w:t>
-      </w:r>
-      <w:proofErr w:type="gramEnd"/>
-      <w:r>
-        <w:rPr>
-          <w:rFonts w:eastAsia="標楷體" w:hint="eastAsia"/>
-          <w:sz w:val="20"/>
-        </w:rPr>
-        <w:t>編號進行資料整合，以建立每條路線對應之配送路線資料與店</w:t>
-      </w:r>
-      <w:proofErr w:type="gramStart"/>
-      <w:r>
-        <w:rPr>
-          <w:rFonts w:eastAsia="標楷體" w:hint="eastAsia"/>
-          <w:sz w:val="20"/>
-        </w:rPr>
-        <w:t>舖</w:t>
-      </w:r>
-      <w:proofErr w:type="gramEnd"/>
-      <w:r>
-        <w:rPr>
-          <w:rFonts w:eastAsia="標楷體" w:hint="eastAsia"/>
-          <w:sz w:val="20"/>
-        </w:rPr>
-        <w:t>清單。同時，針對缺失值、不合理數值及重複紀錄進行檢查與修正，以確保資料的一致性與正確性。</w:t>
-      </w:r>
-      <w:proofErr w:type="gramStart"/>
-      <w:r>
-        <w:rPr>
-          <w:rFonts w:eastAsia="標楷體" w:hint="eastAsia"/>
-          <w:sz w:val="20"/>
-        </w:rPr>
-        <w:t>此外，</w:t>
-      </w:r>
-      <w:proofErr w:type="gramEnd"/>
-      <w:r>
-        <w:rPr>
-          <w:rFonts w:eastAsia="標楷體" w:hint="eastAsia"/>
-          <w:sz w:val="20"/>
-        </w:rPr>
-        <w:t>亦將時間欄位轉換為統一格式，並整理各店</w:t>
-      </w:r>
-      <w:proofErr w:type="gramStart"/>
-      <w:r>
-        <w:rPr>
-          <w:rFonts w:eastAsia="標楷體" w:hint="eastAsia"/>
-          <w:sz w:val="20"/>
-        </w:rPr>
-        <w:t>舖</w:t>
-      </w:r>
-      <w:proofErr w:type="gramEnd"/>
-      <w:r>
-        <w:rPr>
-          <w:rFonts w:eastAsia="標楷體" w:hint="eastAsia"/>
-          <w:sz w:val="20"/>
-        </w:rPr>
-        <w:t>之地理座標、配送時間窗、店</w:t>
-      </w:r>
-      <w:proofErr w:type="gramStart"/>
-      <w:r>
-        <w:rPr>
-          <w:rFonts w:eastAsia="標楷體" w:hint="eastAsia"/>
-          <w:sz w:val="20"/>
-        </w:rPr>
-        <w:t>舖</w:t>
-      </w:r>
-      <w:proofErr w:type="gramEnd"/>
-      <w:r>
-        <w:rPr>
-          <w:rFonts w:eastAsia="標楷體" w:hint="eastAsia"/>
-          <w:sz w:val="20"/>
-        </w:rPr>
-        <w:t>所需材積量</w:t>
-      </w:r>
-      <w:proofErr w:type="gramStart"/>
-      <w:r>
-        <w:rPr>
-          <w:rFonts w:eastAsia="標楷體" w:hint="eastAsia"/>
-          <w:sz w:val="20"/>
-        </w:rPr>
-        <w:t>與滯店時間</w:t>
-      </w:r>
-      <w:proofErr w:type="gramEnd"/>
-      <w:r>
-        <w:rPr>
-          <w:rFonts w:eastAsia="標楷體" w:hint="eastAsia"/>
-          <w:sz w:val="20"/>
-        </w:rPr>
-        <w:t>等資訊，作為後續路線規劃與演算法計算之依據。</w:t>
+        <w:t>在資料前處理過程中，首先將資料來源進行格式統一與欄位對應，並依據路線編號與店舖編號進行資料整合，以建立每條路線對應之配送路線資料與店舖清單。同時，針對缺失值、不合理數值及重複紀錄進行檢查與修正，以確保資料的一致性與正確性。此外，亦將時間欄位轉換為統一格式，並整理各店舖之地理座標、配送時間窗、店舖所需材積量與滯店時間等資訊，作為後續路線規劃與演算法計算之依據。</w:t>
       </w:r>
     </w:p>
     <w:p>
@@ -5522,25 +4869,7 @@
           <w:b/>
           <w:sz w:val="20"/>
         </w:rPr>
-        <w:t>超載路線店</w:t>
-      </w:r>
-      <w:proofErr w:type="gramStart"/>
-      <w:r>
-        <w:rPr>
-          <w:rFonts w:eastAsia="標楷體"/>
-          <w:b/>
-          <w:sz w:val="20"/>
-        </w:rPr>
-        <w:t>舖</w:t>
-      </w:r>
-      <w:proofErr w:type="gramEnd"/>
-      <w:r>
-        <w:rPr>
-          <w:rFonts w:eastAsia="標楷體"/>
-          <w:b/>
-          <w:sz w:val="20"/>
-        </w:rPr>
-        <w:t>抽取</w:t>
+        <w:t>超載路線店舖抽取</w:t>
       </w:r>
     </w:p>
     <w:p>
@@ -5557,39 +4886,7 @@
           <w:rFonts w:eastAsia="標楷體"/>
           <w:sz w:val="20"/>
         </w:rPr>
-        <w:t>本階段針對原始主線路線中發生超載之情形進行店</w:t>
-      </w:r>
-      <w:proofErr w:type="gramStart"/>
-      <w:r>
-        <w:rPr>
-          <w:rFonts w:eastAsia="標楷體"/>
-          <w:sz w:val="20"/>
-        </w:rPr>
-        <w:t>舖</w:t>
-      </w:r>
-      <w:proofErr w:type="gramEnd"/>
-      <w:r>
-        <w:rPr>
-          <w:rFonts w:eastAsia="標楷體"/>
-          <w:sz w:val="20"/>
-        </w:rPr>
-        <w:t>抽取，以確保各路線之總需求量符合車輛容量限制。首先對各路線之總材積進行檢查，當其超出車輛承載上限時，則需移除部分店</w:t>
-      </w:r>
-      <w:proofErr w:type="gramStart"/>
-      <w:r>
-        <w:rPr>
-          <w:rFonts w:eastAsia="標楷體"/>
-          <w:sz w:val="20"/>
-        </w:rPr>
-        <w:t>舖</w:t>
-      </w:r>
-      <w:proofErr w:type="gramEnd"/>
-      <w:r>
-        <w:rPr>
-          <w:rFonts w:eastAsia="標楷體"/>
-          <w:sz w:val="20"/>
-        </w:rPr>
-        <w:t>，使剩餘路線恢復為可行解。</w:t>
+        <w:t>本階段針對原始主線路線中發生超載之情形進行店舖抽取，以確保各路線之總需求量符合車輛容量限制。首先對各路線之總材積進行檢查，當其超出車輛承載上限時，則需移除部分店舖，使剩餘路線恢復為可行解。</w:t>
       </w:r>
       <w:r>
         <w:rPr>
@@ -5743,7 +5040,6 @@
         </w:rPr>
         <w:t>為子族群中的第</w:t>
       </w:r>
-      <w:proofErr w:type="spellStart"/>
       <w:r>
         <w:rPr>
           <w:rFonts w:eastAsia="標楷體" w:hint="eastAsia"/>
@@ -5751,22 +5047,12 @@
         </w:rPr>
         <w:t>i</w:t>
       </w:r>
-      <w:proofErr w:type="spellEnd"/>
-      <w:proofErr w:type="gramStart"/>
-      <w:r>
-        <w:rPr>
-          <w:rFonts w:eastAsia="標楷體" w:hint="eastAsia"/>
-          <w:sz w:val="20"/>
-        </w:rPr>
-        <w:t>個</w:t>
-      </w:r>
-      <w:proofErr w:type="gramEnd"/>
-      <w:r>
-        <w:rPr>
-          <w:rFonts w:eastAsia="標楷體" w:hint="eastAsia"/>
-          <w:sz w:val="20"/>
-        </w:rPr>
-        <w:t>基因</w:t>
+      <w:r>
+        <w:rPr>
+          <w:rFonts w:eastAsia="標楷體" w:hint="eastAsia"/>
+          <w:sz w:val="20"/>
+        </w:rPr>
+        <w:t>個基因</w:t>
       </w:r>
       <w:r>
         <w:rPr>
@@ -5915,7 +5201,21 @@
                       <w:rFonts w:ascii="Cambria Math" w:eastAsia="標楷體" w:hAnsi="Cambria Math"/>
                       <w:sz w:val="20"/>
                     </w:rPr>
-                    <m:t>k,n</m:t>
+                    <m:t>k</m:t>
+                  </m:r>
+                  <m:r>
+                    <w:rPr>
+                      <w:rFonts w:ascii="Cambria Math" w:eastAsia="標楷體" w:hAnsi="Cambria Math"/>
+                      <w:sz w:val="20"/>
+                    </w:rPr>
+                    <m:t>,</m:t>
+                  </m:r>
+                  <m:r>
+                    <w:rPr>
+                      <w:rFonts w:ascii="Cambria Math" w:eastAsia="標楷體" w:hAnsi="Cambria Math"/>
+                      <w:sz w:val="20"/>
+                    </w:rPr>
+                    <m:t>n</m:t>
                   </m:r>
                 </m:sub>
                 <m:sup>
@@ -5973,7 +5273,28 @@
                           <w:rFonts w:ascii="Cambria Math" w:eastAsia="標楷體" w:hAnsi="Cambria Math"/>
                           <w:sz w:val="20"/>
                         </w:rPr>
-                        <m:t>k,n,1</m:t>
+                        <m:t>k</m:t>
+                      </m:r>
+                      <m:r>
+                        <w:rPr>
+                          <w:rFonts w:ascii="Cambria Math" w:eastAsia="標楷體" w:hAnsi="Cambria Math"/>
+                          <w:sz w:val="20"/>
+                        </w:rPr>
+                        <m:t>,</m:t>
+                      </m:r>
+                      <m:r>
+                        <w:rPr>
+                          <w:rFonts w:ascii="Cambria Math" w:eastAsia="標楷體" w:hAnsi="Cambria Math"/>
+                          <w:sz w:val="20"/>
+                        </w:rPr>
+                        <m:t>n</m:t>
+                      </m:r>
+                      <m:r>
+                        <w:rPr>
+                          <w:rFonts w:ascii="Cambria Math" w:eastAsia="標楷體" w:hAnsi="Cambria Math"/>
+                          <w:sz w:val="20"/>
+                        </w:rPr>
+                        <m:t>,1</m:t>
                       </m:r>
                     </m:sub>
                     <m:sup>
@@ -6018,7 +5339,28 @@
                           <w:rFonts w:ascii="Cambria Math" w:eastAsia="標楷體" w:hAnsi="Cambria Math"/>
                           <w:sz w:val="20"/>
                         </w:rPr>
-                        <m:t>k,n,2</m:t>
+                        <m:t>k</m:t>
+                      </m:r>
+                      <m:r>
+                        <w:rPr>
+                          <w:rFonts w:ascii="Cambria Math" w:eastAsia="標楷體" w:hAnsi="Cambria Math"/>
+                          <w:sz w:val="20"/>
+                        </w:rPr>
+                        <m:t>,</m:t>
+                      </m:r>
+                      <m:r>
+                        <w:rPr>
+                          <w:rFonts w:ascii="Cambria Math" w:eastAsia="標楷體" w:hAnsi="Cambria Math"/>
+                          <w:sz w:val="20"/>
+                        </w:rPr>
+                        <m:t>n</m:t>
+                      </m:r>
+                      <m:r>
+                        <w:rPr>
+                          <w:rFonts w:ascii="Cambria Math" w:eastAsia="標楷體" w:hAnsi="Cambria Math"/>
+                          <w:sz w:val="20"/>
+                        </w:rPr>
+                        <m:t>,2</m:t>
                       </m:r>
                     </m:sub>
                     <m:sup>
@@ -6063,7 +5405,28 @@
                           <w:rFonts w:ascii="Cambria Math" w:eastAsia="標楷體" w:hAnsi="Cambria Math"/>
                           <w:sz w:val="20"/>
                         </w:rPr>
-                        <m:t>k,n, |</m:t>
+                        <m:t>k</m:t>
+                      </m:r>
+                      <m:r>
+                        <w:rPr>
+                          <w:rFonts w:ascii="Cambria Math" w:eastAsia="標楷體" w:hAnsi="Cambria Math"/>
+                          <w:sz w:val="20"/>
+                        </w:rPr>
+                        <m:t>,</m:t>
+                      </m:r>
+                      <m:r>
+                        <w:rPr>
+                          <w:rFonts w:ascii="Cambria Math" w:eastAsia="標楷體" w:hAnsi="Cambria Math"/>
+                          <w:sz w:val="20"/>
+                        </w:rPr>
+                        <m:t>n</m:t>
+                      </m:r>
+                      <m:r>
+                        <w:rPr>
+                          <w:rFonts w:ascii="Cambria Math" w:eastAsia="標楷體" w:hAnsi="Cambria Math"/>
+                          <w:sz w:val="20"/>
+                        </w:rPr>
+                        <m:t>, |</m:t>
                       </m:r>
                       <m:sSub>
                         <m:sSubPr>
@@ -6490,7 +5853,25 @@
                       <w:color w:val="auto"/>
                       <w:sz w:val="20"/>
                     </w:rPr>
-                    <m:t>k,n</m:t>
+                    <m:t>k</m:t>
+                  </m:r>
+                  <m:r>
+                    <w:rPr>
+                      <w:rStyle w:val="af"/>
+                      <w:rFonts w:ascii="Cambria Math" w:hAnsi="Cambria Math"/>
+                      <w:color w:val="auto"/>
+                      <w:sz w:val="20"/>
+                    </w:rPr>
+                    <m:t>,</m:t>
+                  </m:r>
+                  <m:r>
+                    <w:rPr>
+                      <w:rStyle w:val="af"/>
+                      <w:rFonts w:ascii="Cambria Math" w:hAnsi="Cambria Math"/>
+                      <w:color w:val="auto"/>
+                      <w:sz w:val="20"/>
+                    </w:rPr>
+                    <m:t>n</m:t>
                   </m:r>
                 </m:sub>
                 <m:sup>
@@ -6567,7 +5948,25 @@
                           <w:color w:val="auto"/>
                           <w:sz w:val="20"/>
                         </w:rPr>
-                        <m:t>k,n</m:t>
+                        <m:t>k</m:t>
+                      </m:r>
+                      <m:r>
+                        <w:rPr>
+                          <w:rStyle w:val="af"/>
+                          <w:rFonts w:ascii="Cambria Math" w:hAnsi="Cambria Math"/>
+                          <w:color w:val="auto"/>
+                          <w:sz w:val="20"/>
+                        </w:rPr>
+                        <m:t>,</m:t>
+                      </m:r>
+                      <m:r>
+                        <w:rPr>
+                          <w:rStyle w:val="af"/>
+                          <w:rFonts w:ascii="Cambria Math" w:hAnsi="Cambria Math"/>
+                          <w:color w:val="auto"/>
+                          <w:sz w:val="20"/>
+                        </w:rPr>
+                        <m:t>n</m:t>
                       </m:r>
                     </m:sub>
                     <m:sup>
@@ -6605,7 +6004,16 @@
                           <w:color w:val="auto"/>
                           <w:sz w:val="20"/>
                         </w:rPr>
-                        <m:t>r=1</m:t>
+                        <m:t>r</m:t>
+                      </m:r>
+                      <m:r>
+                        <w:rPr>
+                          <w:rStyle w:val="af"/>
+                          <w:rFonts w:ascii="Cambria Math" w:hAnsi="Cambria Math"/>
+                          <w:color w:val="auto"/>
+                          <w:sz w:val="20"/>
+                        </w:rPr>
+                        <m:t>=1</m:t>
                       </m:r>
                     </m:sub>
                     <m:sup>
@@ -6686,7 +6094,25 @@
                               <w:color w:val="auto"/>
                               <w:sz w:val="20"/>
                             </w:rPr>
-                            <m:t>k,r</m:t>
+                            <m:t>k</m:t>
+                          </m:r>
+                          <m:r>
+                            <w:rPr>
+                              <w:rStyle w:val="af"/>
+                              <w:rFonts w:ascii="Cambria Math" w:hAnsi="Cambria Math"/>
+                              <w:color w:val="auto"/>
+                              <w:sz w:val="20"/>
+                            </w:rPr>
+                            <m:t>,</m:t>
+                          </m:r>
+                          <m:r>
+                            <w:rPr>
+                              <w:rStyle w:val="af"/>
+                              <w:rFonts w:ascii="Cambria Math" w:hAnsi="Cambria Math"/>
+                              <w:color w:val="auto"/>
+                              <w:sz w:val="20"/>
+                            </w:rPr>
+                            <m:t>r</m:t>
                           </m:r>
                         </m:sub>
                         <m:sup>
@@ -6952,23 +6378,7 @@
           <w:rFonts w:eastAsia="標楷體" w:hint="eastAsia"/>
           <w:sz w:val="20"/>
         </w:rPr>
-        <w:t>店</w:t>
-      </w:r>
-      <w:proofErr w:type="gramStart"/>
-      <w:r>
-        <w:rPr>
-          <w:rFonts w:eastAsia="標楷體" w:hint="eastAsia"/>
-          <w:sz w:val="20"/>
-        </w:rPr>
-        <w:t>舖</w:t>
-      </w:r>
-      <w:proofErr w:type="gramEnd"/>
-      <w:r>
-        <w:rPr>
-          <w:rFonts w:eastAsia="標楷體" w:hint="eastAsia"/>
-          <w:sz w:val="20"/>
-        </w:rPr>
-        <w:t>抽取數量</w:t>
+        <w:t>店舖抽取數量</w:t>
       </w:r>
       <w:r>
         <w:rPr>
@@ -6998,23 +6408,7 @@
           <w:rFonts w:eastAsia="標楷體" w:hint="eastAsia"/>
           <w:sz w:val="20"/>
         </w:rPr>
-        <w:t>為候選店</w:t>
-      </w:r>
-      <w:proofErr w:type="gramStart"/>
-      <w:r>
-        <w:rPr>
-          <w:rFonts w:eastAsia="標楷體" w:hint="eastAsia"/>
-          <w:sz w:val="20"/>
-        </w:rPr>
-        <w:t>舖</w:t>
-      </w:r>
-      <w:proofErr w:type="gramEnd"/>
-      <w:r>
-        <w:rPr>
-          <w:rFonts w:eastAsia="標楷體" w:hint="eastAsia"/>
-          <w:sz w:val="20"/>
-        </w:rPr>
-        <w:t>集合</w:t>
+        <w:t>為候選店舖集合</w:t>
       </w:r>
       <w:r>
         <w:rPr>
@@ -7151,7 +6545,21 @@
                       <w:rFonts w:ascii="Cambria Math" w:eastAsia="標楷體" w:hAnsi="Cambria Math"/>
                       <w:sz w:val="20"/>
                     </w:rPr>
-                    <m:t>vehicle</m:t>
+                    <m:t>ve</m:t>
+                  </m:r>
+                  <m:r>
+                    <w:rPr>
+                      <w:rFonts w:ascii="Cambria Math" w:eastAsia="標楷體" w:hAnsi="Cambria Math"/>
+                      <w:sz w:val="20"/>
+                    </w:rPr>
+                    <m:t>h</m:t>
+                  </m:r>
+                  <m:r>
+                    <w:rPr>
+                      <w:rFonts w:ascii="Cambria Math" w:eastAsia="標楷體" w:hAnsi="Cambria Math"/>
+                      <w:sz w:val="20"/>
+                    </w:rPr>
+                    <m:t>icle</m:t>
                   </m:r>
                 </m:sub>
               </m:sSub>
@@ -7216,7 +6624,28 @@
                   <w:rFonts w:ascii="Cambria Math" w:eastAsia="標楷體" w:hAnsi="Cambria Math"/>
                   <w:sz w:val="20"/>
                 </w:rPr>
-                <m:t>⋅|R|+</m:t>
+                <m:t>⋅</m:t>
+              </m:r>
+              <m:r>
+                <w:rPr>
+                  <w:rFonts w:ascii="Cambria Math" w:eastAsia="標楷體" w:hAnsi="Cambria Math"/>
+                  <w:sz w:val="20"/>
+                </w:rPr>
+                <m:t>|</m:t>
+              </m:r>
+              <m:r>
+                <w:rPr>
+                  <w:rFonts w:ascii="Cambria Math" w:eastAsia="標楷體" w:hAnsi="Cambria Math"/>
+                  <w:sz w:val="20"/>
+                </w:rPr>
+                <m:t>R</m:t>
+              </m:r>
+              <m:r>
+                <w:rPr>
+                  <w:rFonts w:ascii="Cambria Math" w:eastAsia="標楷體" w:hAnsi="Cambria Math"/>
+                  <w:sz w:val="20"/>
+                </w:rPr>
+                <m:t>|+</m:t>
               </m:r>
               <m:sSub>
                 <m:sSubPr>
@@ -7252,7 +6681,21 @@
                   <w:rFonts w:ascii="Cambria Math" w:eastAsia="標楷體" w:hAnsi="Cambria Math"/>
                   <w:sz w:val="20"/>
                 </w:rPr>
-                <m:t>(S)</m:t>
+                <m:t>(</m:t>
+              </m:r>
+              <m:r>
+                <w:rPr>
+                  <w:rFonts w:ascii="Cambria Math" w:eastAsia="標楷體" w:hAnsi="Cambria Math"/>
+                  <w:sz w:val="20"/>
+                </w:rPr>
+                <m:t>S</m:t>
+              </m:r>
+              <m:r>
+                <w:rPr>
+                  <w:rFonts w:ascii="Cambria Math" w:eastAsia="標楷體" w:hAnsi="Cambria Math"/>
+                  <w:sz w:val="20"/>
+                </w:rPr>
+                <m:t>)</m:t>
               </m:r>
               <m:r>
                 <w:rPr>
@@ -7365,23 +6808,7 @@
           <w:rFonts w:eastAsia="標楷體"/>
           <w:sz w:val="20"/>
         </w:rPr>
-        <w:t>函數計算各店</w:t>
-      </w:r>
-      <w:proofErr w:type="gramStart"/>
-      <w:r>
-        <w:rPr>
-          <w:rFonts w:eastAsia="標楷體"/>
-          <w:sz w:val="20"/>
-        </w:rPr>
-        <w:t>舖</w:t>
-      </w:r>
-      <w:proofErr w:type="gramEnd"/>
-      <w:r>
-        <w:rPr>
-          <w:rFonts w:eastAsia="標楷體"/>
-          <w:sz w:val="20"/>
-        </w:rPr>
-        <w:t>之抽取權重，並依據權重決定優先</w:t>
+        <w:t>函數計算各店舖之抽取權重，並依據權重決定優先</w:t>
       </w:r>
       <w:r>
         <w:rPr>
@@ -7395,23 +6822,7 @@
           <w:rFonts w:eastAsia="標楷體"/>
           <w:sz w:val="20"/>
         </w:rPr>
-        <w:t>移出之店</w:t>
-      </w:r>
-      <w:proofErr w:type="gramStart"/>
-      <w:r>
-        <w:rPr>
-          <w:rFonts w:eastAsia="標楷體"/>
-          <w:sz w:val="20"/>
-        </w:rPr>
-        <w:t>舖</w:t>
-      </w:r>
-      <w:proofErr w:type="gramEnd"/>
-      <w:r>
-        <w:rPr>
-          <w:rFonts w:eastAsia="標楷體"/>
-          <w:sz w:val="20"/>
-        </w:rPr>
-        <w:t>。式</w:t>
+        <w:t>移出之店舖。式</w:t>
       </w:r>
       <w:r>
         <w:rPr>
@@ -7425,23 +6836,7 @@
           <w:rFonts w:eastAsia="標楷體"/>
           <w:sz w:val="20"/>
         </w:rPr>
-        <w:t>為店</w:t>
-      </w:r>
-      <w:proofErr w:type="gramStart"/>
-      <w:r>
-        <w:rPr>
-          <w:rFonts w:eastAsia="標楷體"/>
-          <w:sz w:val="20"/>
-        </w:rPr>
-        <w:t>舖</w:t>
-      </w:r>
-      <w:proofErr w:type="gramEnd"/>
-      <w:r>
-        <w:rPr>
-          <w:rFonts w:eastAsia="標楷體"/>
-          <w:sz w:val="20"/>
-        </w:rPr>
-        <w:t>抽取權重函數</w:t>
+        <w:t>為店舖抽取權重函數</w:t>
       </w:r>
       <w:r>
         <w:rPr>
@@ -7494,23 +6889,7 @@
           <w:rFonts w:eastAsia="標楷體" w:hint="eastAsia"/>
           <w:sz w:val="20"/>
         </w:rPr>
-        <w:t>為路線上的店</w:t>
-      </w:r>
-      <w:proofErr w:type="gramStart"/>
-      <w:r>
-        <w:rPr>
-          <w:rFonts w:eastAsia="標楷體" w:hint="eastAsia"/>
-          <w:sz w:val="20"/>
-        </w:rPr>
-        <w:t>舖</w:t>
-      </w:r>
-      <w:proofErr w:type="gramEnd"/>
-      <w:r>
-        <w:rPr>
-          <w:rFonts w:eastAsia="標楷體" w:hint="eastAsia"/>
-          <w:sz w:val="20"/>
-        </w:rPr>
-        <w:t>數量，</w:t>
+        <w:t>為路線上的店舖數量，</w:t>
       </w:r>
       <m:oMath>
         <m:sSub>
@@ -7722,7 +7101,14 @@
                       <w:rFonts w:ascii="Cambria Math" w:eastAsia="標楷體" w:hAnsi="Cambria Math"/>
                       <w:sz w:val="20"/>
                     </w:rPr>
-                    <m:t>0,i</m:t>
+                    <m:t>0,</m:t>
+                  </m:r>
+                  <m:r>
+                    <w:rPr>
+                      <w:rFonts w:ascii="Cambria Math" w:eastAsia="標楷體" w:hAnsi="Cambria Math"/>
+                      <w:sz w:val="20"/>
+                    </w:rPr>
+                    <m:t>i</m:t>
                   </m:r>
                 </m:sub>
               </m:sSub>
@@ -7809,25 +7195,7 @@
           <w:b/>
           <w:sz w:val="20"/>
         </w:rPr>
-        <w:t>候選店</w:t>
-      </w:r>
-      <w:proofErr w:type="gramStart"/>
-      <w:r>
-        <w:rPr>
-          <w:rFonts w:eastAsia="標楷體" w:hint="eastAsia"/>
-          <w:b/>
-          <w:sz w:val="20"/>
-        </w:rPr>
-        <w:t>舖</w:t>
-      </w:r>
-      <w:proofErr w:type="gramEnd"/>
-      <w:r>
-        <w:rPr>
-          <w:rFonts w:eastAsia="標楷體" w:hint="eastAsia"/>
-          <w:b/>
-          <w:sz w:val="20"/>
-        </w:rPr>
-        <w:t>分配</w:t>
+        <w:t>候選店舖分配</w:t>
       </w:r>
     </w:p>
     <w:p>
@@ -7858,23 +7226,7 @@
           <w:rFonts w:eastAsia="標楷體"/>
           <w:sz w:val="20"/>
         </w:rPr>
-        <w:t>超載路線店</w:t>
-      </w:r>
-      <w:proofErr w:type="gramStart"/>
-      <w:r>
-        <w:rPr>
-          <w:rFonts w:eastAsia="標楷體"/>
-          <w:sz w:val="20"/>
-        </w:rPr>
-        <w:t>舖</w:t>
-      </w:r>
-      <w:proofErr w:type="gramEnd"/>
-      <w:r>
-        <w:rPr>
-          <w:rFonts w:eastAsia="標楷體"/>
-          <w:sz w:val="20"/>
-        </w:rPr>
-        <w:t>抽取</w:t>
+        <w:t>超載路線店舖抽取</w:t>
       </w:r>
       <w:r>
         <w:rPr>
@@ -7888,23 +7240,7 @@
           <w:rFonts w:eastAsia="標楷體"/>
           <w:sz w:val="20"/>
         </w:rPr>
-        <w:t>所產生之候選店</w:t>
-      </w:r>
-      <w:proofErr w:type="gramStart"/>
-      <w:r>
-        <w:rPr>
-          <w:rFonts w:eastAsia="標楷體"/>
-          <w:sz w:val="20"/>
-        </w:rPr>
-        <w:t>舖</w:t>
-      </w:r>
-      <w:proofErr w:type="gramEnd"/>
-      <w:r>
-        <w:rPr>
-          <w:rFonts w:eastAsia="標楷體"/>
-          <w:sz w:val="20"/>
-        </w:rPr>
-        <w:t>集合重新</w:t>
+        <w:t>所產生之候選店舖集合重新</w:t>
       </w:r>
       <w:r>
         <w:rPr>
@@ -7946,23 +7282,7 @@
           <w:rFonts w:eastAsia="標楷體"/>
           <w:sz w:val="20"/>
         </w:rPr>
-        <w:t>為進行候選店</w:t>
-      </w:r>
-      <w:proofErr w:type="gramStart"/>
-      <w:r>
-        <w:rPr>
-          <w:rFonts w:eastAsia="標楷體"/>
-          <w:sz w:val="20"/>
-        </w:rPr>
-        <w:t>舖</w:t>
-      </w:r>
-      <w:proofErr w:type="gramEnd"/>
-      <w:r>
-        <w:rPr>
-          <w:rFonts w:eastAsia="標楷體"/>
-          <w:sz w:val="20"/>
-        </w:rPr>
-        <w:t>之重新分配，本研究採用</w:t>
+        <w:t>為進行候選店舖之重新分配，本研究採用</w:t>
       </w:r>
       <w:r>
         <w:rPr>
@@ -7983,23 +7303,7 @@
           <w:rFonts w:eastAsia="標楷體"/>
           <w:sz w:val="20"/>
         </w:rPr>
-        <w:t>並結合</w:t>
-      </w:r>
-      <w:proofErr w:type="gramStart"/>
-      <w:r>
-        <w:rPr>
-          <w:rFonts w:eastAsia="標楷體"/>
-          <w:sz w:val="20"/>
-        </w:rPr>
-        <w:t>變動鄰域下降</w:t>
-      </w:r>
-      <w:proofErr w:type="gramEnd"/>
-      <w:r>
-        <w:rPr>
-          <w:rFonts w:eastAsia="標楷體"/>
-          <w:sz w:val="20"/>
-        </w:rPr>
-        <w:t>法</w:t>
+        <w:t>並結合變動鄰域下降法</w:t>
       </w:r>
       <w:r>
         <w:rPr>
@@ -8074,7 +7378,6 @@
         </w:rPr>
         <w:t>m</w:t>
       </w:r>
-      <w:proofErr w:type="gramStart"/>
       <w:r>
         <w:rPr>
           <w:rFonts w:eastAsia="標楷體" w:hint="eastAsia"/>
@@ -8089,7 +7392,6 @@
         </w:rPr>
         <w:t>螞蟻</w:t>
       </w:r>
-      <w:proofErr w:type="gramEnd"/>
       <w:r>
         <w:rPr>
           <w:rFonts w:eastAsia="標楷體" w:hint="eastAsia"/>
@@ -8221,23 +7523,7 @@
           <w:rFonts w:eastAsia="標楷體" w:hint="eastAsia"/>
           <w:sz w:val="20"/>
         </w:rPr>
-        <w:t>為當下螞蟻可以選擇的</w:t>
-      </w:r>
-      <w:proofErr w:type="gramStart"/>
-      <w:r>
-        <w:rPr>
-          <w:rFonts w:eastAsia="標楷體" w:hint="eastAsia"/>
-          <w:sz w:val="20"/>
-        </w:rPr>
-        <w:t>可行鄰域</w:t>
-      </w:r>
-      <w:proofErr w:type="gramEnd"/>
-      <w:r>
-        <w:rPr>
-          <w:rFonts w:eastAsia="標楷體" w:hint="eastAsia"/>
-          <w:sz w:val="20"/>
-        </w:rPr>
-        <w:t>集合</w:t>
+        <w:t>為當下螞蟻可以選擇的可行鄰域集合</w:t>
       </w:r>
       <w:r>
         <w:rPr>
@@ -8470,23 +7756,7 @@
           <w:rFonts w:eastAsia="標楷體" w:hint="eastAsia"/>
           <w:sz w:val="20"/>
         </w:rPr>
-        <w:t>則為店</w:t>
-      </w:r>
-      <w:proofErr w:type="gramStart"/>
-      <w:r>
-        <w:rPr>
-          <w:rFonts w:eastAsia="標楷體" w:hint="eastAsia"/>
-          <w:sz w:val="20"/>
-        </w:rPr>
-        <w:t>舖</w:t>
-      </w:r>
-      <w:proofErr w:type="gramEnd"/>
-      <w:r>
-        <w:rPr>
-          <w:rFonts w:eastAsia="標楷體" w:hint="eastAsia"/>
-          <w:sz w:val="20"/>
-        </w:rPr>
-        <w:t>的材積量</w:t>
+        <w:t>則為店舖的材積量</w:t>
       </w:r>
       <w:r>
         <w:rPr>
@@ -8552,7 +7822,49 @@
                       <w:rFonts w:ascii="Cambria Math" w:eastAsia="標楷體" w:hAnsi="Cambria Math"/>
                       <w:sz w:val="20"/>
                     </w:rPr>
-                    <m:t>i,j,u,k</m:t>
+                    <m:t>i</m:t>
+                  </m:r>
+                  <m:r>
+                    <w:rPr>
+                      <w:rFonts w:ascii="Cambria Math" w:eastAsia="標楷體" w:hAnsi="Cambria Math"/>
+                      <w:sz w:val="20"/>
+                    </w:rPr>
+                    <m:t>,</m:t>
+                  </m:r>
+                  <m:r>
+                    <w:rPr>
+                      <w:rFonts w:ascii="Cambria Math" w:eastAsia="標楷體" w:hAnsi="Cambria Math"/>
+                      <w:sz w:val="20"/>
+                    </w:rPr>
+                    <m:t>j</m:t>
+                  </m:r>
+                  <m:r>
+                    <w:rPr>
+                      <w:rFonts w:ascii="Cambria Math" w:eastAsia="標楷體" w:hAnsi="Cambria Math"/>
+                      <w:sz w:val="20"/>
+                    </w:rPr>
+                    <m:t>,</m:t>
+                  </m:r>
+                  <m:r>
+                    <w:rPr>
+                      <w:rFonts w:ascii="Cambria Math" w:eastAsia="標楷體" w:hAnsi="Cambria Math"/>
+                      <w:sz w:val="20"/>
+                    </w:rPr>
+                    <m:t>u</m:t>
+                  </m:r>
+                  <m:r>
+                    <w:rPr>
+                      <w:rFonts w:ascii="Cambria Math" w:eastAsia="標楷體" w:hAnsi="Cambria Math"/>
+                      <w:sz w:val="20"/>
+                    </w:rPr>
+                    <m:t>,</m:t>
+                  </m:r>
+                  <m:r>
+                    <w:rPr>
+                      <w:rFonts w:ascii="Cambria Math" w:eastAsia="標楷體" w:hAnsi="Cambria Math"/>
+                      <w:sz w:val="20"/>
+                    </w:rPr>
+                    <m:t>k</m:t>
                   </m:r>
                 </m:sub>
                 <m:sup>
@@ -8608,7 +7920,21 @@
                           <w:rFonts w:ascii="Cambria Math" w:eastAsia="標楷體" w:hAnsi="Cambria Math"/>
                           <w:sz w:val="20"/>
                         </w:rPr>
-                        <m:t>i,u</m:t>
+                        <m:t>i</m:t>
+                      </m:r>
+                      <m:r>
+                        <w:rPr>
+                          <w:rFonts w:ascii="Cambria Math" w:eastAsia="標楷體" w:hAnsi="Cambria Math"/>
+                          <w:sz w:val="20"/>
+                        </w:rPr>
+                        <m:t>,</m:t>
+                      </m:r>
+                      <m:r>
+                        <w:rPr>
+                          <w:rFonts w:ascii="Cambria Math" w:eastAsia="標楷體" w:hAnsi="Cambria Math"/>
+                          <w:sz w:val="20"/>
+                        </w:rPr>
+                        <m:t>u</m:t>
                       </m:r>
                     </m:sub>
                     <m:sup>
@@ -8653,7 +7979,49 @@
                           <w:rFonts w:ascii="Cambria Math" w:eastAsia="標楷體" w:hAnsi="Cambria Math"/>
                           <w:sz w:val="20"/>
                         </w:rPr>
-                        <m:t>i,j,u,k</m:t>
+                        <m:t>i</m:t>
+                      </m:r>
+                      <m:r>
+                        <w:rPr>
+                          <w:rFonts w:ascii="Cambria Math" w:eastAsia="標楷體" w:hAnsi="Cambria Math"/>
+                          <w:sz w:val="20"/>
+                        </w:rPr>
+                        <m:t>,</m:t>
+                      </m:r>
+                      <m:r>
+                        <w:rPr>
+                          <w:rFonts w:ascii="Cambria Math" w:eastAsia="標楷體" w:hAnsi="Cambria Math"/>
+                          <w:sz w:val="20"/>
+                        </w:rPr>
+                        <m:t>j</m:t>
+                      </m:r>
+                      <m:r>
+                        <w:rPr>
+                          <w:rFonts w:ascii="Cambria Math" w:eastAsia="標楷體" w:hAnsi="Cambria Math"/>
+                          <w:sz w:val="20"/>
+                        </w:rPr>
+                        <m:t>,</m:t>
+                      </m:r>
+                      <m:r>
+                        <w:rPr>
+                          <w:rFonts w:ascii="Cambria Math" w:eastAsia="標楷體" w:hAnsi="Cambria Math"/>
+                          <w:sz w:val="20"/>
+                        </w:rPr>
+                        <m:t>u</m:t>
+                      </m:r>
+                      <m:r>
+                        <w:rPr>
+                          <w:rFonts w:ascii="Cambria Math" w:eastAsia="標楷體" w:hAnsi="Cambria Math"/>
+                          <w:sz w:val="20"/>
+                        </w:rPr>
+                        <m:t>,</m:t>
+                      </m:r>
+                      <m:r>
+                        <w:rPr>
+                          <w:rFonts w:ascii="Cambria Math" w:eastAsia="標楷體" w:hAnsi="Cambria Math"/>
+                          <w:sz w:val="20"/>
+                        </w:rPr>
+                        <m:t>k</m:t>
                       </m:r>
                     </m:sub>
                     <m:sup>
@@ -8686,7 +8054,14 @@
                           <w:rFonts w:ascii="Cambria Math" w:eastAsia="標楷體" w:hAnsi="Cambria Math"/>
                           <w:sz w:val="20"/>
                         </w:rPr>
-                        <m:t>z∈</m:t>
+                        <m:t>z</m:t>
+                      </m:r>
+                      <m:r>
+                        <w:rPr>
+                          <w:rFonts w:ascii="Cambria Math" w:eastAsia="標楷體" w:hAnsi="Cambria Math"/>
+                          <w:sz w:val="20"/>
+                        </w:rPr>
+                        <m:t>∈</m:t>
                       </m:r>
                       <m:sSubSup>
                         <m:sSubSupPr>
@@ -8754,7 +8129,21 @@
                               <w:rFonts w:ascii="Cambria Math" w:eastAsia="標楷體" w:hAnsi="Cambria Math"/>
                               <w:sz w:val="20"/>
                             </w:rPr>
-                            <m:t>i,z</m:t>
+                            <m:t>i</m:t>
+                          </m:r>
+                          <m:r>
+                            <w:rPr>
+                              <w:rFonts w:ascii="Cambria Math" w:eastAsia="標楷體" w:hAnsi="Cambria Math"/>
+                              <w:sz w:val="20"/>
+                            </w:rPr>
+                            <m:t>,</m:t>
+                          </m:r>
+                          <m:r>
+                            <w:rPr>
+                              <w:rFonts w:ascii="Cambria Math" w:eastAsia="標楷體" w:hAnsi="Cambria Math"/>
+                              <w:sz w:val="20"/>
+                            </w:rPr>
+                            <m:t>z</m:t>
                           </m:r>
                         </m:sub>
                         <m:sup>
@@ -8799,7 +8188,49 @@
                               <w:rFonts w:ascii="Cambria Math" w:eastAsia="標楷體" w:hAnsi="Cambria Math"/>
                               <w:sz w:val="20"/>
                             </w:rPr>
-                            <m:t>i, j,z,k</m:t>
+                            <m:t>i</m:t>
+                          </m:r>
+                          <m:r>
+                            <w:rPr>
+                              <w:rFonts w:ascii="Cambria Math" w:eastAsia="標楷體" w:hAnsi="Cambria Math"/>
+                              <w:sz w:val="20"/>
+                            </w:rPr>
+                            <m:t xml:space="preserve">, </m:t>
+                          </m:r>
+                          <m:r>
+                            <w:rPr>
+                              <w:rFonts w:ascii="Cambria Math" w:eastAsia="標楷體" w:hAnsi="Cambria Math"/>
+                              <w:sz w:val="20"/>
+                            </w:rPr>
+                            <m:t>j</m:t>
+                          </m:r>
+                          <m:r>
+                            <w:rPr>
+                              <w:rFonts w:ascii="Cambria Math" w:eastAsia="標楷體" w:hAnsi="Cambria Math"/>
+                              <w:sz w:val="20"/>
+                            </w:rPr>
+                            <m:t>,</m:t>
+                          </m:r>
+                          <m:r>
+                            <w:rPr>
+                              <w:rFonts w:ascii="Cambria Math" w:eastAsia="標楷體" w:hAnsi="Cambria Math"/>
+                              <w:sz w:val="20"/>
+                            </w:rPr>
+                            <m:t>z</m:t>
+                          </m:r>
+                          <m:r>
+                            <w:rPr>
+                              <w:rFonts w:ascii="Cambria Math" w:eastAsia="標楷體" w:hAnsi="Cambria Math"/>
+                              <w:sz w:val="20"/>
+                            </w:rPr>
+                            <m:t>,</m:t>
+                          </m:r>
+                          <m:r>
+                            <w:rPr>
+                              <w:rFonts w:ascii="Cambria Math" w:eastAsia="標楷體" w:hAnsi="Cambria Math"/>
+                              <w:sz w:val="20"/>
+                            </w:rPr>
+                            <m:t>k</m:t>
                           </m:r>
                         </m:sub>
                         <m:sup>
@@ -8913,7 +8344,49 @@
                       <w:rFonts w:ascii="Cambria Math" w:eastAsia="標楷體" w:hAnsi="Cambria Math"/>
                       <w:sz w:val="20"/>
                     </w:rPr>
-                    <m:t>i,j,u,k</m:t>
+                    <m:t>i</m:t>
+                  </m:r>
+                  <m:r>
+                    <w:rPr>
+                      <w:rFonts w:ascii="Cambria Math" w:eastAsia="標楷體" w:hAnsi="Cambria Math"/>
+                      <w:sz w:val="20"/>
+                    </w:rPr>
+                    <m:t>,</m:t>
+                  </m:r>
+                  <m:r>
+                    <w:rPr>
+                      <w:rFonts w:ascii="Cambria Math" w:eastAsia="標楷體" w:hAnsi="Cambria Math"/>
+                      <w:sz w:val="20"/>
+                    </w:rPr>
+                    <m:t>j</m:t>
+                  </m:r>
+                  <m:r>
+                    <w:rPr>
+                      <w:rFonts w:ascii="Cambria Math" w:eastAsia="標楷體" w:hAnsi="Cambria Math"/>
+                      <w:sz w:val="20"/>
+                    </w:rPr>
+                    <m:t>,</m:t>
+                  </m:r>
+                  <m:r>
+                    <w:rPr>
+                      <w:rFonts w:ascii="Cambria Math" w:eastAsia="標楷體" w:hAnsi="Cambria Math"/>
+                      <w:sz w:val="20"/>
+                    </w:rPr>
+                    <m:t>u</m:t>
+                  </m:r>
+                  <m:r>
+                    <w:rPr>
+                      <w:rFonts w:ascii="Cambria Math" w:eastAsia="標楷體" w:hAnsi="Cambria Math"/>
+                      <w:sz w:val="20"/>
+                    </w:rPr>
+                    <m:t>,</m:t>
+                  </m:r>
+                  <m:r>
+                    <w:rPr>
+                      <w:rFonts w:ascii="Cambria Math" w:eastAsia="標楷體" w:hAnsi="Cambria Math"/>
+                      <w:sz w:val="20"/>
+                    </w:rPr>
+                    <m:t>k</m:t>
                   </m:r>
                 </m:sub>
               </m:sSub>
@@ -9006,7 +8479,35 @@
                           <w:rFonts w:ascii="Cambria Math" w:eastAsia="標楷體" w:hAnsi="Cambria Math"/>
                           <w:sz w:val="20"/>
                         </w:rPr>
-                        <m:t>i,j,u</m:t>
+                        <m:t>i</m:t>
+                      </m:r>
+                      <m:r>
+                        <w:rPr>
+                          <w:rFonts w:ascii="Cambria Math" w:eastAsia="標楷體" w:hAnsi="Cambria Math"/>
+                          <w:sz w:val="20"/>
+                        </w:rPr>
+                        <m:t>,</m:t>
+                      </m:r>
+                      <m:r>
+                        <w:rPr>
+                          <w:rFonts w:ascii="Cambria Math" w:eastAsia="標楷體" w:hAnsi="Cambria Math"/>
+                          <w:sz w:val="20"/>
+                        </w:rPr>
+                        <m:t>j</m:t>
+                      </m:r>
+                      <m:r>
+                        <w:rPr>
+                          <w:rFonts w:ascii="Cambria Math" w:eastAsia="標楷體" w:hAnsi="Cambria Math"/>
+                          <w:sz w:val="20"/>
+                        </w:rPr>
+                        <m:t>,</m:t>
+                      </m:r>
+                      <m:r>
+                        <w:rPr>
+                          <w:rFonts w:ascii="Cambria Math" w:eastAsia="標楷體" w:hAnsi="Cambria Math"/>
+                          <w:sz w:val="20"/>
+                        </w:rPr>
+                        <m:t>u</m:t>
                       </m:r>
                     </m:sub>
                     <m:sup>
@@ -9087,7 +8588,35 @@
                           <w:rFonts w:ascii="Cambria Math" w:eastAsia="標楷體" w:hAnsi="Cambria Math"/>
                           <w:sz w:val="20"/>
                         </w:rPr>
-                        <m:t>i,j,u</m:t>
+                        <m:t>i</m:t>
+                      </m:r>
+                      <m:r>
+                        <w:rPr>
+                          <w:rFonts w:ascii="Cambria Math" w:eastAsia="標楷體" w:hAnsi="Cambria Math"/>
+                          <w:sz w:val="20"/>
+                        </w:rPr>
+                        <m:t>,</m:t>
+                      </m:r>
+                      <m:r>
+                        <w:rPr>
+                          <w:rFonts w:ascii="Cambria Math" w:eastAsia="標楷體" w:hAnsi="Cambria Math"/>
+                          <w:sz w:val="20"/>
+                        </w:rPr>
+                        <m:t>j</m:t>
+                      </m:r>
+                      <m:r>
+                        <w:rPr>
+                          <w:rFonts w:ascii="Cambria Math" w:eastAsia="標楷體" w:hAnsi="Cambria Math"/>
+                          <w:sz w:val="20"/>
+                        </w:rPr>
+                        <m:t>,</m:t>
+                      </m:r>
+                      <m:r>
+                        <w:rPr>
+                          <w:rFonts w:ascii="Cambria Math" w:eastAsia="標楷體" w:hAnsi="Cambria Math"/>
+                          <w:sz w:val="20"/>
+                        </w:rPr>
+                        <m:t>u</m:t>
                       </m:r>
                     </m:sub>
                     <m:sup>
@@ -9192,7 +8721,35 @@
                       <w:rFonts w:ascii="Cambria Math" w:eastAsia="標楷體" w:hAnsi="Cambria Math"/>
                       <w:sz w:val="20"/>
                     </w:rPr>
-                    <m:t>i,j,u</m:t>
+                    <m:t>i</m:t>
+                  </m:r>
+                  <m:r>
+                    <w:rPr>
+                      <w:rFonts w:ascii="Cambria Math" w:eastAsia="標楷體" w:hAnsi="Cambria Math"/>
+                      <w:sz w:val="20"/>
+                    </w:rPr>
+                    <m:t>,</m:t>
+                  </m:r>
+                  <m:r>
+                    <w:rPr>
+                      <w:rFonts w:ascii="Cambria Math" w:eastAsia="標楷體" w:hAnsi="Cambria Math"/>
+                      <w:sz w:val="20"/>
+                    </w:rPr>
+                    <m:t>j</m:t>
+                  </m:r>
+                  <m:r>
+                    <w:rPr>
+                      <w:rFonts w:ascii="Cambria Math" w:eastAsia="標楷體" w:hAnsi="Cambria Math"/>
+                      <w:sz w:val="20"/>
+                    </w:rPr>
+                    <m:t>,</m:t>
+                  </m:r>
+                  <m:r>
+                    <w:rPr>
+                      <w:rFonts w:ascii="Cambria Math" w:eastAsia="標楷體" w:hAnsi="Cambria Math"/>
+                      <w:sz w:val="20"/>
+                    </w:rPr>
+                    <m:t>u</m:t>
                   </m:r>
                 </m:sub>
                 <m:sup>
@@ -9237,7 +8794,21 @@
                       <w:rFonts w:ascii="Cambria Math" w:eastAsia="標楷體" w:hAnsi="Cambria Math"/>
                       <w:sz w:val="20"/>
                     </w:rPr>
-                    <m:t>i,u</m:t>
+                    <m:t>i</m:t>
+                  </m:r>
+                  <m:r>
+                    <w:rPr>
+                      <w:rFonts w:ascii="Cambria Math" w:eastAsia="標楷體" w:hAnsi="Cambria Math"/>
+                      <w:sz w:val="20"/>
+                    </w:rPr>
+                    <m:t>,</m:t>
+                  </m:r>
+                  <m:r>
+                    <w:rPr>
+                      <w:rFonts w:ascii="Cambria Math" w:eastAsia="標楷體" w:hAnsi="Cambria Math"/>
+                      <w:sz w:val="20"/>
+                    </w:rPr>
+                    <m:t>u</m:t>
                   </m:r>
                 </m:sub>
               </m:sSub>
@@ -9273,7 +8844,21 @@
                       <w:rFonts w:ascii="Cambria Math" w:eastAsia="標楷體" w:hAnsi="Cambria Math"/>
                       <w:sz w:val="20"/>
                     </w:rPr>
-                    <m:t>u,j</m:t>
+                    <m:t>u</m:t>
+                  </m:r>
+                  <m:r>
+                    <w:rPr>
+                      <w:rFonts w:ascii="Cambria Math" w:eastAsia="標楷體" w:hAnsi="Cambria Math"/>
+                      <w:sz w:val="20"/>
+                    </w:rPr>
+                    <m:t>,</m:t>
+                  </m:r>
+                  <m:r>
+                    <w:rPr>
+                      <w:rFonts w:ascii="Cambria Math" w:eastAsia="標楷體" w:hAnsi="Cambria Math"/>
+                      <w:sz w:val="20"/>
+                    </w:rPr>
+                    <m:t>j</m:t>
                   </m:r>
                 </m:sub>
               </m:sSub>
@@ -9309,7 +8894,21 @@
                       <w:rFonts w:ascii="Cambria Math" w:eastAsia="標楷體" w:hAnsi="Cambria Math"/>
                       <w:sz w:val="20"/>
                     </w:rPr>
-                    <m:t>i,j</m:t>
+                    <m:t>i</m:t>
+                  </m:r>
+                  <m:r>
+                    <w:rPr>
+                      <w:rFonts w:ascii="Cambria Math" w:eastAsia="標楷體" w:hAnsi="Cambria Math"/>
+                      <w:sz w:val="20"/>
+                    </w:rPr>
+                    <m:t>,</m:t>
+                  </m:r>
+                  <m:r>
+                    <w:rPr>
+                      <w:rFonts w:ascii="Cambria Math" w:eastAsia="標楷體" w:hAnsi="Cambria Math"/>
+                      <w:sz w:val="20"/>
+                    </w:rPr>
+                    <m:t>j</m:t>
                   </m:r>
                 </m:sub>
               </m:sSub>
@@ -9403,7 +9002,35 @@
                       <w:rFonts w:ascii="Cambria Math" w:eastAsia="標楷體" w:hAnsi="Cambria Math"/>
                       <w:sz w:val="20"/>
                     </w:rPr>
-                    <m:t>i,j,u</m:t>
+                    <m:t>i</m:t>
+                  </m:r>
+                  <m:r>
+                    <w:rPr>
+                      <w:rFonts w:ascii="Cambria Math" w:eastAsia="標楷體" w:hAnsi="Cambria Math"/>
+                      <w:sz w:val="20"/>
+                    </w:rPr>
+                    <m:t>,</m:t>
+                  </m:r>
+                  <m:r>
+                    <w:rPr>
+                      <w:rFonts w:ascii="Cambria Math" w:eastAsia="標楷體" w:hAnsi="Cambria Math"/>
+                      <w:sz w:val="20"/>
+                    </w:rPr>
+                    <m:t>j</m:t>
+                  </m:r>
+                  <m:r>
+                    <w:rPr>
+                      <w:rFonts w:ascii="Cambria Math" w:eastAsia="標楷體" w:hAnsi="Cambria Math"/>
+                      <w:sz w:val="20"/>
+                    </w:rPr>
+                    <m:t>,</m:t>
+                  </m:r>
+                  <m:r>
+                    <w:rPr>
+                      <w:rFonts w:ascii="Cambria Math" w:eastAsia="標楷體" w:hAnsi="Cambria Math"/>
+                      <w:sz w:val="20"/>
+                    </w:rPr>
+                    <m:t>u</m:t>
                   </m:r>
                 </m:sub>
                 <m:sup>
@@ -9582,17 +9209,8 @@
           <w:rFonts w:eastAsia="標楷體" w:hint="eastAsia"/>
           <w:sz w:val="20"/>
         </w:rPr>
-        <w:t>於每次建</w:t>
-      </w:r>
-      <w:proofErr w:type="gramStart"/>
-      <w:r>
-        <w:rPr>
-          <w:rFonts w:eastAsia="標楷體" w:hint="eastAsia"/>
-          <w:sz w:val="20"/>
-        </w:rPr>
-        <w:t>構解時</w:t>
-      </w:r>
-      <w:proofErr w:type="gramEnd"/>
+        <w:t>於每次建構解時</w:t>
+      </w:r>
       <w:r>
         <w:rPr>
           <w:rFonts w:eastAsia="標楷體" w:hint="eastAsia"/>
@@ -9863,7 +9481,21 @@
                       <w:rFonts w:ascii="Cambria Math" w:eastAsia="標楷體" w:hAnsi="Cambria Math"/>
                       <w:sz w:val="20"/>
                     </w:rPr>
-                    <m:t>i,j</m:t>
+                    <m:t>i</m:t>
+                  </m:r>
+                  <m:r>
+                    <w:rPr>
+                      <w:rFonts w:ascii="Cambria Math" w:eastAsia="標楷體" w:hAnsi="Cambria Math"/>
+                      <w:sz w:val="20"/>
+                    </w:rPr>
+                    <m:t>,</m:t>
+                  </m:r>
+                  <m:r>
+                    <w:rPr>
+                      <w:rFonts w:ascii="Cambria Math" w:eastAsia="標楷體" w:hAnsi="Cambria Math"/>
+                      <w:sz w:val="20"/>
+                    </w:rPr>
+                    <m:t>j</m:t>
                   </m:r>
                 </m:sub>
               </m:sSub>
@@ -9890,7 +9522,14 @@
                       <w:rFonts w:ascii="Cambria Math" w:eastAsia="標楷體" w:hAnsi="Cambria Math"/>
                       <w:sz w:val="20"/>
                     </w:rPr>
-                    <m:t>1-ρ</m:t>
+                    <m:t>1-</m:t>
+                  </m:r>
+                  <m:r>
+                    <w:rPr>
+                      <w:rFonts w:ascii="Cambria Math" w:eastAsia="標楷體" w:hAnsi="Cambria Math"/>
+                      <w:sz w:val="20"/>
+                    </w:rPr>
+                    <m:t>ρ</m:t>
                   </m:r>
                 </m:e>
               </m:d>
@@ -9926,7 +9565,21 @@
                       <w:rFonts w:ascii="Cambria Math" w:eastAsia="標楷體" w:hAnsi="Cambria Math"/>
                       <w:sz w:val="20"/>
                     </w:rPr>
-                    <m:t>i,j</m:t>
+                    <m:t>i</m:t>
+                  </m:r>
+                  <m:r>
+                    <w:rPr>
+                      <w:rFonts w:ascii="Cambria Math" w:eastAsia="標楷體" w:hAnsi="Cambria Math"/>
+                      <w:sz w:val="20"/>
+                    </w:rPr>
+                    <m:t>,</m:t>
+                  </m:r>
+                  <m:r>
+                    <w:rPr>
+                      <w:rFonts w:ascii="Cambria Math" w:eastAsia="標楷體" w:hAnsi="Cambria Math"/>
+                      <w:sz w:val="20"/>
+                    </w:rPr>
+                    <m:t>j</m:t>
                   </m:r>
                 </m:sub>
               </m:sSub>
@@ -9935,7 +9588,21 @@
                   <w:rFonts w:ascii="Cambria Math" w:eastAsia="標楷體" w:hAnsi="Cambria Math"/>
                   <w:sz w:val="20"/>
                 </w:rPr>
-                <m:t>+ρ⋅</m:t>
+                <m:t>+</m:t>
+              </m:r>
+              <m:r>
+                <w:rPr>
+                  <w:rFonts w:ascii="Cambria Math" w:eastAsia="標楷體" w:hAnsi="Cambria Math"/>
+                  <w:sz w:val="20"/>
+                </w:rPr>
+                <m:t>ρ</m:t>
+              </m:r>
+              <m:r>
+                <w:rPr>
+                  <w:rFonts w:ascii="Cambria Math" w:eastAsia="標楷體" w:hAnsi="Cambria Math"/>
+                  <w:sz w:val="20"/>
+                </w:rPr>
+                <m:t>⋅</m:t>
               </m:r>
               <m:sSub>
                 <m:sSubPr>
@@ -10054,7 +9721,21 @@
                       <w:rFonts w:ascii="Cambria Math" w:eastAsia="標楷體" w:hAnsi="Cambria Math"/>
                       <w:sz w:val="20"/>
                     </w:rPr>
-                    <m:t>i,j</m:t>
+                    <m:t>i</m:t>
+                  </m:r>
+                  <m:r>
+                    <w:rPr>
+                      <w:rFonts w:ascii="Cambria Math" w:eastAsia="標楷體" w:hAnsi="Cambria Math"/>
+                      <w:sz w:val="20"/>
+                    </w:rPr>
+                    <m:t>,</m:t>
+                  </m:r>
+                  <m:r>
+                    <w:rPr>
+                      <w:rFonts w:ascii="Cambria Math" w:eastAsia="標楷體" w:hAnsi="Cambria Math"/>
+                      <w:sz w:val="20"/>
+                    </w:rPr>
+                    <m:t>j</m:t>
                   </m:r>
                 </m:sub>
               </m:sSub>
@@ -10081,7 +9762,14 @@
                       <w:rFonts w:ascii="Cambria Math" w:eastAsia="標楷體" w:hAnsi="Cambria Math"/>
                       <w:sz w:val="20"/>
                     </w:rPr>
-                    <m:t>1-ρ</m:t>
+                    <m:t>1-</m:t>
+                  </m:r>
+                  <m:r>
+                    <w:rPr>
+                      <w:rFonts w:ascii="Cambria Math" w:eastAsia="標楷體" w:hAnsi="Cambria Math"/>
+                      <w:sz w:val="20"/>
+                    </w:rPr>
+                    <m:t>ρ</m:t>
                   </m:r>
                 </m:e>
               </m:d>
@@ -10117,7 +9805,21 @@
                       <w:rFonts w:ascii="Cambria Math" w:eastAsia="標楷體" w:hAnsi="Cambria Math"/>
                       <w:sz w:val="20"/>
                     </w:rPr>
-                    <m:t>i,j</m:t>
+                    <m:t>i</m:t>
+                  </m:r>
+                  <m:r>
+                    <w:rPr>
+                      <w:rFonts w:ascii="Cambria Math" w:eastAsia="標楷體" w:hAnsi="Cambria Math"/>
+                      <w:sz w:val="20"/>
+                    </w:rPr>
+                    <m:t>,</m:t>
+                  </m:r>
+                  <m:r>
+                    <w:rPr>
+                      <w:rFonts w:ascii="Cambria Math" w:eastAsia="標楷體" w:hAnsi="Cambria Math"/>
+                      <w:sz w:val="20"/>
+                    </w:rPr>
+                    <m:t>j</m:t>
                   </m:r>
                 </m:sub>
               </m:sSub>
@@ -10126,7 +9828,21 @@
                   <w:rFonts w:ascii="Cambria Math" w:eastAsia="標楷體" w:hAnsi="Cambria Math"/>
                   <w:sz w:val="20"/>
                 </w:rPr>
-                <m:t>+ρ⋅</m:t>
+                <m:t>+</m:t>
+              </m:r>
+              <m:r>
+                <w:rPr>
+                  <w:rFonts w:ascii="Cambria Math" w:eastAsia="標楷體" w:hAnsi="Cambria Math"/>
+                  <w:sz w:val="20"/>
+                </w:rPr>
+                <m:t>ρ</m:t>
+              </m:r>
+              <m:r>
+                <w:rPr>
+                  <w:rFonts w:ascii="Cambria Math" w:eastAsia="標楷體" w:hAnsi="Cambria Math"/>
+                  <w:sz w:val="20"/>
+                </w:rPr>
+                <m:t>⋅</m:t>
               </m:r>
               <m:r>
                 <m:rPr>
@@ -10163,7 +9879,21 @@
                       <w:rFonts w:ascii="Cambria Math" w:eastAsia="標楷體" w:hAnsi="Cambria Math"/>
                       <w:sz w:val="20"/>
                     </w:rPr>
-                    <m:t>i,j</m:t>
+                    <m:t>i</m:t>
+                  </m:r>
+                  <m:r>
+                    <w:rPr>
+                      <w:rFonts w:ascii="Cambria Math" w:eastAsia="標楷體" w:hAnsi="Cambria Math"/>
+                      <w:sz w:val="20"/>
+                    </w:rPr>
+                    <m:t>,</m:t>
+                  </m:r>
+                  <m:r>
+                    <w:rPr>
+                      <w:rFonts w:ascii="Cambria Math" w:eastAsia="標楷體" w:hAnsi="Cambria Math"/>
+                      <w:sz w:val="20"/>
+                    </w:rPr>
+                    <m:t>j</m:t>
                   </m:r>
                 </m:sub>
               </m:sSub>
@@ -10267,7 +9997,21 @@
                       <w:rFonts w:ascii="Cambria Math" w:eastAsia="標楷體" w:hAnsi="Cambria Math"/>
                       <w:sz w:val="20"/>
                     </w:rPr>
-                    <m:t>i,j</m:t>
+                    <m:t>i</m:t>
+                  </m:r>
+                  <m:r>
+                    <w:rPr>
+                      <w:rFonts w:ascii="Cambria Math" w:eastAsia="標楷體" w:hAnsi="Cambria Math"/>
+                      <w:sz w:val="20"/>
+                    </w:rPr>
+                    <m:t>,</m:t>
+                  </m:r>
+                  <m:r>
+                    <w:rPr>
+                      <w:rFonts w:ascii="Cambria Math" w:eastAsia="標楷體" w:hAnsi="Cambria Math"/>
+                      <w:sz w:val="20"/>
+                    </w:rPr>
+                    <m:t>j</m:t>
                   </m:r>
                 </m:sub>
               </m:sSub>
@@ -10327,7 +10071,28 @@
                               <w:rFonts w:ascii="Cambria Math" w:eastAsia="標楷體" w:hAnsi="Cambria Math"/>
                               <w:sz w:val="20"/>
                             </w:rPr>
-                            <m:t>F(S)</m:t>
+                            <m:t>F</m:t>
+                          </m:r>
+                          <m:r>
+                            <w:rPr>
+                              <w:rFonts w:ascii="Cambria Math" w:eastAsia="標楷體" w:hAnsi="Cambria Math"/>
+                              <w:sz w:val="20"/>
+                            </w:rPr>
+                            <m:t>(</m:t>
+                          </m:r>
+                          <m:r>
+                            <w:rPr>
+                              <w:rFonts w:ascii="Cambria Math" w:eastAsia="標楷體" w:hAnsi="Cambria Math"/>
+                              <w:sz w:val="20"/>
+                            </w:rPr>
+                            <m:t>S</m:t>
+                          </m:r>
+                          <m:r>
+                            <w:rPr>
+                              <w:rFonts w:ascii="Cambria Math" w:eastAsia="標楷體" w:hAnsi="Cambria Math"/>
+                              <w:sz w:val="20"/>
+                            </w:rPr>
+                            <m:t>)</m:t>
                           </m:r>
                         </m:den>
                       </m:f>
@@ -10336,7 +10101,63 @@
                           <w:rFonts w:ascii="Cambria Math" w:eastAsia="標楷體" w:hAnsi="Cambria Math"/>
                           <w:sz w:val="20"/>
                         </w:rPr>
-                        <m:t xml:space="preserve">  if the edge </m:t>
+                        <m:t xml:space="preserve">  </m:t>
+                      </m:r>
+                      <m:r>
+                        <w:rPr>
+                          <w:rFonts w:ascii="Cambria Math" w:eastAsia="標楷體" w:hAnsi="Cambria Math"/>
+                          <w:sz w:val="20"/>
+                        </w:rPr>
+                        <m:t>if</m:t>
+                      </m:r>
+                      <m:r>
+                        <w:rPr>
+                          <w:rFonts w:ascii="Cambria Math" w:eastAsia="標楷體" w:hAnsi="Cambria Math"/>
+                          <w:sz w:val="20"/>
+                        </w:rPr>
+                        <m:t xml:space="preserve"> </m:t>
+                      </m:r>
+                      <m:r>
+                        <w:rPr>
+                          <w:rFonts w:ascii="Cambria Math" w:eastAsia="標楷體" w:hAnsi="Cambria Math"/>
+                          <w:sz w:val="20"/>
+                        </w:rPr>
+                        <m:t>t</m:t>
+                      </m:r>
+                      <m:r>
+                        <w:rPr>
+                          <w:rFonts w:ascii="Cambria Math" w:eastAsia="標楷體" w:hAnsi="Cambria Math"/>
+                          <w:sz w:val="20"/>
+                        </w:rPr>
+                        <m:t>h</m:t>
+                      </m:r>
+                      <m:r>
+                        <w:rPr>
+                          <w:rFonts w:ascii="Cambria Math" w:eastAsia="標楷體" w:hAnsi="Cambria Math"/>
+                          <w:sz w:val="20"/>
+                        </w:rPr>
+                        <m:t>e</m:t>
+                      </m:r>
+                      <m:r>
+                        <w:rPr>
+                          <w:rFonts w:ascii="Cambria Math" w:eastAsia="標楷體" w:hAnsi="Cambria Math"/>
+                          <w:sz w:val="20"/>
+                        </w:rPr>
+                        <m:t xml:space="preserve"> </m:t>
+                      </m:r>
+                      <m:r>
+                        <w:rPr>
+                          <w:rFonts w:ascii="Cambria Math" w:eastAsia="標楷體" w:hAnsi="Cambria Math"/>
+                          <w:sz w:val="20"/>
+                        </w:rPr>
+                        <m:t>edge</m:t>
+                      </m:r>
+                      <m:r>
+                        <w:rPr>
+                          <w:rFonts w:ascii="Cambria Math" w:eastAsia="標楷體" w:hAnsi="Cambria Math"/>
+                          <w:sz w:val="20"/>
+                        </w:rPr>
+                        <m:t xml:space="preserve"> </m:t>
                       </m:r>
                       <m:d>
                         <m:dPr>
@@ -10354,7 +10175,21 @@
                               <w:rFonts w:ascii="Cambria Math" w:eastAsia="標楷體" w:hAnsi="Cambria Math"/>
                               <w:sz w:val="20"/>
                             </w:rPr>
-                            <m:t>i,j</m:t>
+                            <m:t>i</m:t>
+                          </m:r>
+                          <m:r>
+                            <w:rPr>
+                              <w:rFonts w:ascii="Cambria Math" w:eastAsia="標楷體" w:hAnsi="Cambria Math"/>
+                              <w:sz w:val="20"/>
+                            </w:rPr>
+                            <m:t>,</m:t>
+                          </m:r>
+                          <m:r>
+                            <w:rPr>
+                              <w:rFonts w:ascii="Cambria Math" w:eastAsia="標楷體" w:hAnsi="Cambria Math"/>
+                              <w:sz w:val="20"/>
+                            </w:rPr>
+                            <m:t>j</m:t>
                           </m:r>
                         </m:e>
                       </m:d>
@@ -10363,7 +10198,21 @@
                           <w:rFonts w:ascii="Cambria Math" w:eastAsia="標楷體" w:hAnsi="Cambria Math"/>
                           <w:sz w:val="20"/>
                         </w:rPr>
-                        <m:t>∈S,</m:t>
+                        <m:t>∈</m:t>
+                      </m:r>
+                      <m:r>
+                        <w:rPr>
+                          <w:rFonts w:ascii="Cambria Math" w:eastAsia="標楷體" w:hAnsi="Cambria Math"/>
+                          <w:sz w:val="20"/>
+                        </w:rPr>
+                        <m:t>S</m:t>
+                      </m:r>
+                      <m:r>
+                        <w:rPr>
+                          <w:rFonts w:ascii="Cambria Math" w:eastAsia="標楷體" w:hAnsi="Cambria Math"/>
+                          <w:sz w:val="20"/>
+                        </w:rPr>
+                        <m:t>,</m:t>
                       </m:r>
                     </m:e>
                     <m:e>
@@ -10372,7 +10221,35 @@
                           <w:rFonts w:ascii="Cambria Math" w:eastAsia="標楷體" w:hAnsi="Cambria Math"/>
                           <w:sz w:val="20"/>
                         </w:rPr>
-                        <m:t>0  otherwise,</m:t>
+                        <m:t xml:space="preserve">0  </m:t>
+                      </m:r>
+                      <m:r>
+                        <w:rPr>
+                          <w:rFonts w:ascii="Cambria Math" w:eastAsia="標楷體" w:hAnsi="Cambria Math"/>
+                          <w:sz w:val="20"/>
+                        </w:rPr>
+                        <m:t>ot</m:t>
+                      </m:r>
+                      <m:r>
+                        <w:rPr>
+                          <w:rFonts w:ascii="Cambria Math" w:eastAsia="標楷體" w:hAnsi="Cambria Math"/>
+                          <w:sz w:val="20"/>
+                        </w:rPr>
+                        <m:t>h</m:t>
+                      </m:r>
+                      <m:r>
+                        <w:rPr>
+                          <w:rFonts w:ascii="Cambria Math" w:eastAsia="標楷體" w:hAnsi="Cambria Math"/>
+                          <w:sz w:val="20"/>
+                        </w:rPr>
+                        <m:t>erwise</m:t>
+                      </m:r>
+                      <m:r>
+                        <w:rPr>
+                          <w:rFonts w:ascii="Cambria Math" w:eastAsia="標楷體" w:hAnsi="Cambria Math"/>
+                          <w:sz w:val="20"/>
+                        </w:rPr>
+                        <m:t>,</m:t>
                       </m:r>
                     </m:e>
                   </m:eqArr>
@@ -10431,53 +10308,12 @@
           <w:sz w:val="20"/>
         </w:rPr>
       </w:pPr>
-      <w:proofErr w:type="gramStart"/>
-      <w:r>
-        <w:rPr>
-          <w:rFonts w:eastAsia="標楷體"/>
-          <w:sz w:val="20"/>
-        </w:rPr>
-        <w:t>此外，</w:t>
-      </w:r>
-      <w:proofErr w:type="gramEnd"/>
-      <w:r>
-        <w:rPr>
-          <w:rFonts w:eastAsia="標楷體"/>
-          <w:sz w:val="20"/>
-        </w:rPr>
-        <w:t>為進一步</w:t>
-      </w:r>
-      <w:proofErr w:type="gramStart"/>
-      <w:r>
-        <w:rPr>
-          <w:rFonts w:eastAsia="標楷體"/>
-          <w:sz w:val="20"/>
-        </w:rPr>
-        <w:t>強</w:t>
-      </w:r>
-      <w:proofErr w:type="gramEnd"/>
-      <w:r>
-        <w:rPr>
-          <w:rFonts w:eastAsia="標楷體"/>
-          <w:sz w:val="20"/>
-        </w:rPr>
-        <w:t>化解品質，本研究於每</w:t>
-      </w:r>
-      <w:proofErr w:type="gramStart"/>
-      <w:r>
-        <w:rPr>
-          <w:rFonts w:eastAsia="標楷體"/>
-          <w:sz w:val="20"/>
-        </w:rPr>
-        <w:t>隻螞蟻</w:t>
-      </w:r>
-      <w:proofErr w:type="gramEnd"/>
-      <w:r>
-        <w:rPr>
-          <w:rFonts w:eastAsia="標楷體"/>
-          <w:sz w:val="20"/>
-        </w:rPr>
-        <w:t>完成路徑建構後導入</w:t>
+      <w:r>
+        <w:rPr>
+          <w:rFonts w:eastAsia="標楷體"/>
+          <w:sz w:val="20"/>
+        </w:rPr>
+        <w:t>此外，為進一步強化解品質，本研究於每隻螞蟻完成路徑建構後導入</w:t>
       </w:r>
       <w:r>
         <w:rPr>
@@ -10491,81 +10327,8 @@
           <w:rFonts w:eastAsia="標楷體"/>
           <w:sz w:val="20"/>
         </w:rPr>
-        <w:t>局部搜尋機制，透過</w:t>
-      </w:r>
-      <w:proofErr w:type="gramStart"/>
-      <w:r>
-        <w:rPr>
-          <w:rFonts w:eastAsia="標楷體"/>
-          <w:sz w:val="20"/>
-        </w:rPr>
-        <w:t>多種鄰域</w:t>
-      </w:r>
-      <w:proofErr w:type="gramEnd"/>
-      <w:r>
-        <w:rPr>
-          <w:rFonts w:eastAsia="標楷體"/>
-          <w:sz w:val="20"/>
-        </w:rPr>
-        <w:t>結構進行改善，並依序探索</w:t>
-      </w:r>
-      <w:proofErr w:type="gramStart"/>
-      <w:r>
-        <w:rPr>
-          <w:rFonts w:eastAsia="標楷體"/>
-          <w:sz w:val="20"/>
-        </w:rPr>
-        <w:t>不同鄰域</w:t>
-      </w:r>
-      <w:proofErr w:type="gramEnd"/>
-      <w:r>
-        <w:rPr>
-          <w:rFonts w:eastAsia="標楷體"/>
-          <w:sz w:val="20"/>
-        </w:rPr>
-        <w:t>集合，當</w:t>
-      </w:r>
-      <w:proofErr w:type="gramStart"/>
-      <w:r>
-        <w:rPr>
-          <w:rFonts w:eastAsia="標楷體"/>
-          <w:sz w:val="20"/>
-        </w:rPr>
-        <w:t>當前鄰域</w:t>
-      </w:r>
-      <w:proofErr w:type="gramEnd"/>
-      <w:r>
-        <w:rPr>
-          <w:rFonts w:eastAsia="標楷體"/>
-          <w:sz w:val="20"/>
-        </w:rPr>
-        <w:t>無法產生更</w:t>
-      </w:r>
-      <w:proofErr w:type="gramStart"/>
-      <w:r>
-        <w:rPr>
-          <w:rFonts w:eastAsia="標楷體"/>
-          <w:sz w:val="20"/>
-        </w:rPr>
-        <w:t>佳解時</w:t>
-      </w:r>
-      <w:proofErr w:type="gramEnd"/>
-      <w:r>
-        <w:rPr>
-          <w:rFonts w:eastAsia="標楷體"/>
-          <w:sz w:val="20"/>
-        </w:rPr>
-        <w:t>即切換至</w:t>
-      </w:r>
-      <w:proofErr w:type="gramStart"/>
-      <w:r>
-        <w:rPr>
-          <w:rFonts w:eastAsia="標楷體"/>
-          <w:sz w:val="20"/>
-        </w:rPr>
-        <w:t>下一鄰域</w:t>
-      </w:r>
-      <w:proofErr w:type="gramEnd"/>
+        <w:t>局部搜尋機制，透過多種鄰域結構進行改善，並依序探索不同鄰域集合，當當前鄰域無法產生更佳解時即切換至下一鄰域</w:t>
+      </w:r>
       <m:oMath>
         <m:sSub>
           <m:sSubPr>
@@ -10609,23 +10372,7 @@
           <w:rFonts w:eastAsia="標楷體"/>
           <w:sz w:val="20"/>
         </w:rPr>
-        <w:t>，</w:t>
-      </w:r>
-      <w:proofErr w:type="gramStart"/>
-      <w:r>
-        <w:rPr>
-          <w:rFonts w:eastAsia="標楷體"/>
-          <w:sz w:val="20"/>
-        </w:rPr>
-        <w:t>直至解無法</w:t>
-      </w:r>
-      <w:proofErr w:type="gramEnd"/>
-      <w:r>
-        <w:rPr>
-          <w:rFonts w:eastAsia="標楷體"/>
-          <w:sz w:val="20"/>
-        </w:rPr>
-        <w:t>再被改善為止。</w:t>
+        <w:t>，直至解無法再被改善為止。</w:t>
       </w:r>
       <w:r>
         <w:rPr>
@@ -10857,7 +10604,21 @@
                               <w:rFonts w:ascii="Cambria Math" w:eastAsia="標楷體" w:hAnsi="Cambria Math"/>
                               <w:sz w:val="20"/>
                             </w:rPr>
-                            <m:t>(S)</m:t>
+                            <m:t>(</m:t>
+                          </m:r>
+                          <m:r>
+                            <w:rPr>
+                              <w:rFonts w:ascii="Cambria Math" w:eastAsia="標楷體" w:hAnsi="Cambria Math"/>
+                              <w:sz w:val="20"/>
+                            </w:rPr>
+                            <m:t>S</m:t>
+                          </m:r>
+                          <m:r>
+                            <w:rPr>
+                              <w:rFonts w:ascii="Cambria Math" w:eastAsia="標楷體" w:hAnsi="Cambria Math"/>
+                              <w:sz w:val="20"/>
+                            </w:rPr>
+                            <m:t>)</m:t>
                           </m:r>
                         </m:lim>
                       </m:limLow>
@@ -10868,7 +10629,14 @@
                           <w:rFonts w:ascii="Cambria Math" w:eastAsia="標楷體" w:hAnsi="Cambria Math" w:hint="eastAsia"/>
                           <w:sz w:val="20"/>
                         </w:rPr>
-                        <m:t>F(</m:t>
+                        <m:t>F</m:t>
+                      </m:r>
+                      <m:r>
+                        <w:rPr>
+                          <w:rFonts w:ascii="Cambria Math" w:eastAsia="標楷體" w:hAnsi="Cambria Math" w:hint="eastAsia"/>
+                          <w:sz w:val="20"/>
+                        </w:rPr>
+                        <m:t>(</m:t>
                       </m:r>
                       <m:sSup>
                         <m:sSupPr>
@@ -11031,23 +10799,7 @@
           <w:rFonts w:eastAsia="標楷體" w:hint="eastAsia"/>
           <w:sz w:val="20"/>
         </w:rPr>
-        <w:t>的候選店</w:t>
-      </w:r>
-      <w:proofErr w:type="gramStart"/>
-      <w:r>
-        <w:rPr>
-          <w:rFonts w:eastAsia="標楷體" w:hint="eastAsia"/>
-          <w:sz w:val="20"/>
-        </w:rPr>
-        <w:t>舖</w:t>
-      </w:r>
-      <w:proofErr w:type="gramEnd"/>
-      <w:r>
-        <w:rPr>
-          <w:rFonts w:eastAsia="標楷體" w:hint="eastAsia"/>
-          <w:sz w:val="20"/>
-        </w:rPr>
-        <w:t>進行支援線規劃</w:t>
+        <w:t>的候選店舖進行支援線規劃</w:t>
       </w:r>
       <w:r>
         <w:rPr>
@@ -11126,21 +10878,12 @@
         </w:rPr>
         <w:t>架構中，</w:t>
       </w:r>
-      <w:proofErr w:type="gramStart"/>
-      <w:r>
-        <w:rPr>
-          <w:rFonts w:eastAsia="標楷體"/>
-          <w:sz w:val="20"/>
-        </w:rPr>
-        <w:t>不同蟻群分別</w:t>
-      </w:r>
-      <w:proofErr w:type="gramEnd"/>
-      <w:r>
-        <w:rPr>
-          <w:rFonts w:eastAsia="標楷體"/>
-          <w:sz w:val="20"/>
-        </w:rPr>
-        <w:t>針對不同目標進行搜尋</w:t>
+      <w:r>
+        <w:rPr>
+          <w:rFonts w:eastAsia="標楷體"/>
+          <w:sz w:val="20"/>
+        </w:rPr>
+        <w:t>不同蟻群分別針對不同目標進行搜尋</w:t>
       </w:r>
       <w:r>
         <w:rPr>
@@ -11271,7 +11014,6 @@
         </w:rPr>
         <w:t>m</w:t>
       </w:r>
-      <w:proofErr w:type="gramStart"/>
       <w:r>
         <w:rPr>
           <w:rFonts w:eastAsia="標楷體" w:hint="eastAsia"/>
@@ -11286,7 +11028,6 @@
         </w:rPr>
         <w:t>螞蟻</w:t>
       </w:r>
-      <w:proofErr w:type="gramEnd"/>
       <w:r>
         <w:rPr>
           <w:rFonts w:eastAsia="標楷體" w:hint="eastAsia"/>
@@ -11397,39 +11138,7 @@
           <w:rFonts w:eastAsia="標楷體"/>
           <w:sz w:val="20"/>
         </w:rPr>
-        <w:t>為距離啟發資訊，表示當前店</w:t>
-      </w:r>
-      <w:proofErr w:type="gramStart"/>
-      <w:r>
-        <w:rPr>
-          <w:rFonts w:eastAsia="標楷體"/>
-          <w:sz w:val="20"/>
-        </w:rPr>
-        <w:t>舖</w:t>
-      </w:r>
-      <w:proofErr w:type="gramEnd"/>
-      <w:r>
-        <w:rPr>
-          <w:rFonts w:eastAsia="標楷體"/>
-          <w:sz w:val="20"/>
-        </w:rPr>
-        <w:t>到各候選店</w:t>
-      </w:r>
-      <w:proofErr w:type="gramStart"/>
-      <w:r>
-        <w:rPr>
-          <w:rFonts w:eastAsia="標楷體"/>
-          <w:sz w:val="20"/>
-        </w:rPr>
-        <w:t>舖</w:t>
-      </w:r>
-      <w:proofErr w:type="gramEnd"/>
-      <w:r>
-        <w:rPr>
-          <w:rFonts w:eastAsia="標楷體"/>
-          <w:sz w:val="20"/>
-        </w:rPr>
-        <w:t>之</w:t>
+        <w:t>為距離啟發資訊，表示當前店舖到各候選店舖之</w:t>
       </w:r>
       <w:r>
         <w:rPr>
@@ -11478,39 +11187,7 @@
           <w:rFonts w:eastAsia="標楷體"/>
           <w:sz w:val="20"/>
         </w:rPr>
-        <w:t>表示當前店</w:t>
-      </w:r>
-      <w:proofErr w:type="gramStart"/>
-      <w:r>
-        <w:rPr>
-          <w:rFonts w:eastAsia="標楷體"/>
-          <w:sz w:val="20"/>
-        </w:rPr>
-        <w:t>舖</w:t>
-      </w:r>
-      <w:proofErr w:type="gramEnd"/>
-      <w:r>
-        <w:rPr>
-          <w:rFonts w:eastAsia="標楷體"/>
-          <w:sz w:val="20"/>
-        </w:rPr>
-        <w:t>至候選店</w:t>
-      </w:r>
-      <w:proofErr w:type="gramStart"/>
-      <w:r>
-        <w:rPr>
-          <w:rFonts w:eastAsia="標楷體"/>
-          <w:sz w:val="20"/>
-        </w:rPr>
-        <w:t>舖</w:t>
-      </w:r>
-      <w:proofErr w:type="gramEnd"/>
-      <w:r>
-        <w:rPr>
-          <w:rFonts w:eastAsia="標楷體"/>
-          <w:sz w:val="20"/>
-        </w:rPr>
-        <w:t>之移動成本</w:t>
+        <w:t>表示當前店舖至候選店舖之移動成本</w:t>
       </w:r>
       <w:r>
         <w:rPr>
@@ -11583,23 +11260,7 @@
           <w:rFonts w:eastAsia="標楷體"/>
           <w:sz w:val="20"/>
         </w:rPr>
-        <w:t>使其在構</w:t>
-      </w:r>
-      <w:proofErr w:type="gramStart"/>
-      <w:r>
-        <w:rPr>
-          <w:rFonts w:eastAsia="標楷體"/>
-          <w:sz w:val="20"/>
-        </w:rPr>
-        <w:t>建解時</w:t>
-      </w:r>
-      <w:proofErr w:type="gramEnd"/>
-      <w:r>
-        <w:rPr>
-          <w:rFonts w:eastAsia="標楷體"/>
-          <w:sz w:val="20"/>
-        </w:rPr>
-        <w:t>更容易被選擇</w:t>
+        <w:t>使其在構建解時更容易被選擇</w:t>
       </w:r>
       <w:r>
         <w:rPr>
@@ -11665,7 +11326,21 @@
                       <w:rFonts w:ascii="Cambria Math" w:eastAsia="標楷體" w:hAnsi="Cambria Math"/>
                       <w:sz w:val="20"/>
                     </w:rPr>
-                    <m:t>i,j</m:t>
+                    <m:t>i</m:t>
+                  </m:r>
+                  <m:r>
+                    <w:rPr>
+                      <w:rFonts w:ascii="Cambria Math" w:eastAsia="標楷體" w:hAnsi="Cambria Math"/>
+                      <w:sz w:val="20"/>
+                    </w:rPr>
+                    <m:t>,</m:t>
+                  </m:r>
+                  <m:r>
+                    <w:rPr>
+                      <w:rFonts w:ascii="Cambria Math" w:eastAsia="標楷體" w:hAnsi="Cambria Math"/>
+                      <w:sz w:val="20"/>
+                    </w:rPr>
+                    <m:t>j</m:t>
                   </m:r>
                 </m:sub>
                 <m:sup>
@@ -11721,7 +11396,21 @@
                           <w:rFonts w:ascii="Cambria Math" w:eastAsia="標楷體" w:hAnsi="Cambria Math"/>
                           <w:sz w:val="20"/>
                         </w:rPr>
-                        <m:t>i,j</m:t>
+                        <m:t>i</m:t>
+                      </m:r>
+                      <m:r>
+                        <w:rPr>
+                          <w:rFonts w:ascii="Cambria Math" w:eastAsia="標楷體" w:hAnsi="Cambria Math"/>
+                          <w:sz w:val="20"/>
+                        </w:rPr>
+                        <m:t>,</m:t>
+                      </m:r>
+                      <m:r>
+                        <w:rPr>
+                          <w:rFonts w:ascii="Cambria Math" w:eastAsia="標楷體" w:hAnsi="Cambria Math"/>
+                          <w:sz w:val="20"/>
+                        </w:rPr>
+                        <m:t>j</m:t>
                       </m:r>
                     </m:sub>
                   </m:sSub>
@@ -11757,7 +11446,21 @@
                           <w:rFonts w:ascii="Cambria Math" w:eastAsia="標楷體" w:hAnsi="Cambria Math"/>
                           <w:sz w:val="20"/>
                         </w:rPr>
-                        <m:t>i,j</m:t>
+                        <m:t>i</m:t>
+                      </m:r>
+                      <m:r>
+                        <w:rPr>
+                          <w:rFonts w:ascii="Cambria Math" w:eastAsia="標楷體" w:hAnsi="Cambria Math"/>
+                          <w:sz w:val="20"/>
+                        </w:rPr>
+                        <m:t>,</m:t>
+                      </m:r>
+                      <m:r>
+                        <w:rPr>
+                          <w:rFonts w:ascii="Cambria Math" w:eastAsia="標楷體" w:hAnsi="Cambria Math"/>
+                          <w:sz w:val="20"/>
+                        </w:rPr>
+                        <m:t>j</m:t>
                       </m:r>
                     </m:sub>
                     <m:sup>
@@ -11790,7 +11493,14 @@
                           <w:rFonts w:ascii="Cambria Math" w:eastAsia="標楷體" w:hAnsi="Cambria Math"/>
                           <w:sz w:val="20"/>
                         </w:rPr>
-                        <m:t>z∈</m:t>
+                        <m:t>z</m:t>
+                      </m:r>
+                      <m:r>
+                        <w:rPr>
+                          <w:rFonts w:ascii="Cambria Math" w:eastAsia="標楷體" w:hAnsi="Cambria Math"/>
+                          <w:sz w:val="20"/>
+                        </w:rPr>
+                        <m:t>∈</m:t>
                       </m:r>
                       <m:sSubSup>
                         <m:sSubSupPr>
@@ -11858,7 +11568,21 @@
                               <w:rFonts w:ascii="Cambria Math" w:eastAsia="標楷體" w:hAnsi="Cambria Math"/>
                               <w:sz w:val="20"/>
                             </w:rPr>
-                            <m:t>i,z</m:t>
+                            <m:t>i</m:t>
+                          </m:r>
+                          <m:r>
+                            <w:rPr>
+                              <w:rFonts w:ascii="Cambria Math" w:eastAsia="標楷體" w:hAnsi="Cambria Math"/>
+                              <w:sz w:val="20"/>
+                            </w:rPr>
+                            <m:t>,</m:t>
+                          </m:r>
+                          <m:r>
+                            <w:rPr>
+                              <w:rFonts w:ascii="Cambria Math" w:eastAsia="標楷體" w:hAnsi="Cambria Math"/>
+                              <w:sz w:val="20"/>
+                            </w:rPr>
+                            <m:t>z</m:t>
                           </m:r>
                         </m:sub>
                       </m:sSub>
@@ -11894,7 +11618,21 @@
                               <w:rFonts w:ascii="Cambria Math" w:eastAsia="標楷體" w:hAnsi="Cambria Math"/>
                               <w:sz w:val="20"/>
                             </w:rPr>
-                            <m:t>i, z</m:t>
+                            <m:t>i</m:t>
+                          </m:r>
+                          <m:r>
+                            <w:rPr>
+                              <w:rFonts w:ascii="Cambria Math" w:eastAsia="標楷體" w:hAnsi="Cambria Math"/>
+                              <w:sz w:val="20"/>
+                            </w:rPr>
+                            <m:t xml:space="preserve">, </m:t>
+                          </m:r>
+                          <m:r>
+                            <w:rPr>
+                              <w:rFonts w:ascii="Cambria Math" w:eastAsia="標楷體" w:hAnsi="Cambria Math"/>
+                              <w:sz w:val="20"/>
+                            </w:rPr>
+                            <m:t>z</m:t>
                           </m:r>
                         </m:sub>
                         <m:sup>
@@ -12016,7 +11754,21 @@
                       <w:rFonts w:ascii="Cambria Math" w:eastAsia="標楷體" w:hAnsi="Cambria Math"/>
                       <w:sz w:val="20"/>
                     </w:rPr>
-                    <m:t>i,j</m:t>
+                    <m:t>i</m:t>
+                  </m:r>
+                  <m:r>
+                    <w:rPr>
+                      <w:rFonts w:ascii="Cambria Math" w:eastAsia="標楷體" w:hAnsi="Cambria Math"/>
+                      <w:sz w:val="20"/>
+                    </w:rPr>
+                    <m:t>,</m:t>
+                  </m:r>
+                  <m:r>
+                    <w:rPr>
+                      <w:rFonts w:ascii="Cambria Math" w:eastAsia="標楷體" w:hAnsi="Cambria Math"/>
+                      <w:sz w:val="20"/>
+                    </w:rPr>
+                    <m:t>j</m:t>
                   </m:r>
                 </m:sub>
               </m:sSub>
@@ -12072,7 +11824,21 @@
                           <w:rFonts w:ascii="Cambria Math" w:eastAsia="標楷體" w:hAnsi="Cambria Math"/>
                           <w:sz w:val="20"/>
                         </w:rPr>
-                        <m:t>i,j</m:t>
+                        <m:t>i</m:t>
+                      </m:r>
+                      <m:r>
+                        <w:rPr>
+                          <w:rFonts w:ascii="Cambria Math" w:eastAsia="標楷體" w:hAnsi="Cambria Math"/>
+                          <w:sz w:val="20"/>
+                        </w:rPr>
+                        <m:t>,</m:t>
+                      </m:r>
+                      <m:r>
+                        <w:rPr>
+                          <w:rFonts w:ascii="Cambria Math" w:eastAsia="標楷體" w:hAnsi="Cambria Math"/>
+                          <w:sz w:val="20"/>
+                        </w:rPr>
+                        <m:t>j</m:t>
                       </m:r>
                     </m:sub>
                   </m:sSub>
@@ -12181,7 +11947,21 @@
                       <w:rFonts w:ascii="Cambria Math" w:eastAsia="標楷體" w:hAnsi="Cambria Math"/>
                       <w:sz w:val="20"/>
                     </w:rPr>
-                    <m:t>i,j</m:t>
+                    <m:t>i</m:t>
+                  </m:r>
+                  <m:r>
+                    <w:rPr>
+                      <w:rFonts w:ascii="Cambria Math" w:eastAsia="標楷體" w:hAnsi="Cambria Math"/>
+                      <w:sz w:val="20"/>
+                    </w:rPr>
+                    <m:t>,</m:t>
+                  </m:r>
+                  <m:r>
+                    <w:rPr>
+                      <w:rFonts w:ascii="Cambria Math" w:eastAsia="標楷體" w:hAnsi="Cambria Math"/>
+                      <w:sz w:val="20"/>
+                    </w:rPr>
+                    <m:t>j</m:t>
                   </m:r>
                 </m:sub>
               </m:sSub>
@@ -12234,7 +12014,21 @@
                       <w:rFonts w:ascii="Cambria Math" w:eastAsia="標楷體" w:hAnsi="Cambria Math"/>
                       <w:sz w:val="20"/>
                     </w:rPr>
-                    <m:t>i,j</m:t>
+                    <m:t>i</m:t>
+                  </m:r>
+                  <m:r>
+                    <w:rPr>
+                      <w:rFonts w:ascii="Cambria Math" w:eastAsia="標楷體" w:hAnsi="Cambria Math"/>
+                      <w:sz w:val="20"/>
+                    </w:rPr>
+                    <m:t>,</m:t>
+                  </m:r>
+                  <m:r>
+                    <w:rPr>
+                      <w:rFonts w:ascii="Cambria Math" w:eastAsia="標楷體" w:hAnsi="Cambria Math"/>
+                      <w:sz w:val="20"/>
+                    </w:rPr>
+                    <m:t>j</m:t>
                   </m:r>
                 </m:sub>
               </m:sSub>
@@ -12243,7 +12037,14 @@
                   <w:rFonts w:ascii="Cambria Math" w:eastAsia="標楷體" w:hAnsi="Cambria Math"/>
                   <w:sz w:val="20"/>
                 </w:rPr>
-                <m:t>-I</m:t>
+                <m:t>-</m:t>
+              </m:r>
+              <m:r>
+                <w:rPr>
+                  <w:rFonts w:ascii="Cambria Math" w:eastAsia="標楷體" w:hAnsi="Cambria Math"/>
+                  <w:sz w:val="20"/>
+                </w:rPr>
+                <m:t>I</m:t>
               </m:r>
               <m:sSub>
                 <m:sSubPr>
@@ -12333,85 +12134,12 @@
           <w:sz w:val="20"/>
         </w:rPr>
       </w:pPr>
-      <w:proofErr w:type="gramStart"/>
-      <w:r>
-        <w:rPr>
-          <w:rFonts w:eastAsia="標楷體"/>
-          <w:sz w:val="20"/>
-        </w:rPr>
-        <w:t>此外，</w:t>
-      </w:r>
-      <w:proofErr w:type="gramEnd"/>
-      <w:r>
-        <w:rPr>
-          <w:rFonts w:eastAsia="標楷體"/>
-          <w:sz w:val="20"/>
-        </w:rPr>
-        <w:t>為反映實務限制，本研究依據店</w:t>
-      </w:r>
-      <w:proofErr w:type="gramStart"/>
-      <w:r>
-        <w:rPr>
-          <w:rFonts w:eastAsia="標楷體"/>
-          <w:sz w:val="20"/>
-        </w:rPr>
-        <w:t>舖</w:t>
-      </w:r>
-      <w:proofErr w:type="gramEnd"/>
-      <w:r>
-        <w:rPr>
-          <w:rFonts w:eastAsia="標楷體"/>
-          <w:sz w:val="20"/>
-        </w:rPr>
-        <w:t>與物流中心的地理位置，將路線劃分</w:t>
-      </w:r>
-      <w:proofErr w:type="gramStart"/>
-      <w:r>
-        <w:rPr>
-          <w:rFonts w:eastAsia="標楷體"/>
-          <w:sz w:val="20"/>
-        </w:rPr>
-        <w:t>為近區</w:t>
-      </w:r>
-      <w:proofErr w:type="gramEnd"/>
-      <w:r>
-        <w:rPr>
-          <w:rFonts w:eastAsia="標楷體"/>
-          <w:sz w:val="20"/>
-        </w:rPr>
-        <w:t>、中區</w:t>
-      </w:r>
-      <w:proofErr w:type="gramStart"/>
-      <w:r>
-        <w:rPr>
-          <w:rFonts w:eastAsia="標楷體"/>
-          <w:sz w:val="20"/>
-        </w:rPr>
-        <w:t>與遠區</w:t>
-      </w:r>
-      <w:proofErr w:type="gramEnd"/>
-      <w:r>
-        <w:rPr>
-          <w:rFonts w:eastAsia="標楷體"/>
-          <w:sz w:val="20"/>
-        </w:rPr>
-        <w:t>，同時結合東、西、南、北方向的區域劃分，以減少跨區配送帶來的效率問題，以提升整體配送效率。</w:t>
-      </w:r>
-      <w:proofErr w:type="gramStart"/>
-      <w:r>
-        <w:rPr>
-          <w:rFonts w:eastAsia="標楷體"/>
-          <w:sz w:val="20"/>
-        </w:rPr>
-        <w:t>此外，</w:t>
-      </w:r>
-      <w:proofErr w:type="gramEnd"/>
-      <w:r>
-        <w:rPr>
-          <w:rFonts w:eastAsia="標楷體"/>
-          <w:sz w:val="20"/>
-        </w:rPr>
-        <w:t>所</w:t>
+      <w:r>
+        <w:rPr>
+          <w:rFonts w:eastAsia="標楷體"/>
+          <w:sz w:val="20"/>
+        </w:rPr>
+        <w:t>此外，為反映實務限制，本研究依據店舖與物流中心的地理位置，將路線劃分為近區、中區與遠區，同時結合東、西、南、北方向的區域劃分，以減少跨區配送帶來的效率問題，以提升整體配送效率。此外，所</w:t>
       </w:r>
       <w:r>
         <w:rPr>
@@ -12425,62 +12153,14 @@
           <w:rFonts w:eastAsia="標楷體"/>
           <w:sz w:val="20"/>
         </w:rPr>
-        <w:t>支援</w:t>
-      </w:r>
-      <w:proofErr w:type="gramStart"/>
-      <w:r>
-        <w:rPr>
-          <w:rFonts w:eastAsia="標楷體"/>
-          <w:sz w:val="20"/>
-        </w:rPr>
-        <w:t>線均需遵守</w:t>
-      </w:r>
-      <w:proofErr w:type="gramEnd"/>
-      <w:r>
-        <w:rPr>
-          <w:rFonts w:eastAsia="標楷體"/>
-          <w:sz w:val="20"/>
-        </w:rPr>
-        <w:t>五小時以內的行駛時間限制，同時取得各店</w:t>
-      </w:r>
-      <w:proofErr w:type="gramStart"/>
-      <w:r>
-        <w:rPr>
-          <w:rFonts w:eastAsia="標楷體"/>
-          <w:sz w:val="20"/>
-        </w:rPr>
-        <w:t>舖</w:t>
-      </w:r>
-      <w:proofErr w:type="gramEnd"/>
-      <w:r>
-        <w:rPr>
-          <w:rFonts w:eastAsia="標楷體"/>
-          <w:sz w:val="20"/>
-        </w:rPr>
-        <w:t>的預定到達時間，</w:t>
-      </w:r>
-      <w:r>
-        <w:rPr>
-          <w:rFonts w:eastAsia="標楷體"/>
-          <w:sz w:val="20"/>
-        </w:rPr>
-        <w:t>確保每間店</w:t>
-      </w:r>
-      <w:proofErr w:type="gramStart"/>
-      <w:r>
-        <w:rPr>
-          <w:rFonts w:eastAsia="標楷體"/>
-          <w:sz w:val="20"/>
-        </w:rPr>
-        <w:t>舖</w:t>
-      </w:r>
-      <w:proofErr w:type="gramEnd"/>
-      <w:r>
-        <w:rPr>
-          <w:rFonts w:eastAsia="標楷體"/>
-          <w:sz w:val="20"/>
-        </w:rPr>
-        <w:t>的服務時間落在其允許的時間窗範圍內。</w:t>
+        <w:t>支援線均需遵守五小時以內的行駛時間限制，同時取得各店舖的預定到達時間，</w:t>
+      </w:r>
+      <w:r>
+        <w:rPr>
+          <w:rFonts w:eastAsia="標楷體"/>
+          <w:sz w:val="20"/>
+        </w:rPr>
+        <w:t>確保每間店舖的服務時間落在其允許的時間窗範圍內。</w:t>
       </w:r>
     </w:p>
     <w:p>
@@ -12881,23 +12561,7 @@
           <w:rFonts w:eastAsia="標楷體"/>
           <w:sz w:val="20"/>
         </w:rPr>
-        <w:t>將評估該流程在物流公司提供之資料集上的路線編排效果，並進一步檢視整體路線編排績效指標，以確認結果是否符合預期，從而驗證其在實務配送環境中的可行性與穩定性。</w:t>
-      </w:r>
-      <w:proofErr w:type="gramStart"/>
-      <w:r>
-        <w:rPr>
-          <w:rFonts w:eastAsia="標楷體"/>
-          <w:sz w:val="20"/>
-        </w:rPr>
-        <w:t>此外，</w:t>
-      </w:r>
-      <w:proofErr w:type="gramEnd"/>
-      <w:r>
-        <w:rPr>
-          <w:rFonts w:eastAsia="標楷體"/>
-          <w:sz w:val="20"/>
-        </w:rPr>
-        <w:t>為更全面評估所提方法之效能，亦將進一步與基準方法進行比較分析。</w:t>
+        <w:t>將評估該流程在物流公司提供之資料集上的路線編排效果，並進一步檢視整體路線編排績效指標，以確認結果是否符合預期，從而驗證其在實務配送環境中的可行性與穩定性。此外，為更全面評估所提方法之效能，亦將進一步與基準方法進行比較分析。</w:t>
       </w:r>
     </w:p>
     <w:p>
@@ -14092,33 +13756,8 @@
           <w:rFonts w:eastAsia="標楷體"/>
           <w:sz w:val="20"/>
         </w:rPr>
-        <w:t>組案例進行實驗分析。系統完成路線規劃後，進一步從車輛數量、總行駛距離、平均路線裝載率、平均</w:t>
-      </w:r>
-      <w:proofErr w:type="gramStart"/>
-      <w:r>
-        <w:rPr>
-          <w:rFonts w:eastAsia="標楷體"/>
-          <w:sz w:val="20"/>
-        </w:rPr>
-        <w:t>準</w:t>
-      </w:r>
-      <w:proofErr w:type="gramEnd"/>
-      <w:r>
-        <w:rPr>
-          <w:rFonts w:eastAsia="標楷體"/>
-          <w:sz w:val="20"/>
-        </w:rPr>
-        <w:t>點率及規劃時間等指標進行量化評估，以檢視整體路線編排效能。此實驗旨在驗證所提方法於實際配送情境下之可行性與有效性，相關結果</w:t>
-      </w:r>
-      <w:proofErr w:type="gramStart"/>
-      <w:r>
-        <w:rPr>
-          <w:rFonts w:eastAsia="標楷體"/>
-          <w:sz w:val="20"/>
-        </w:rPr>
-        <w:t>彙整如</w:t>
-      </w:r>
-      <w:proofErr w:type="gramEnd"/>
+        <w:t>組案例進行實驗分析。系統完成路線規劃後，進一步從車輛數量、總行駛距離、平均路線裝載率、平均準點率及規劃時間等指標進行量化評估，以檢視整體路線編排效能。此實驗旨在驗證所提方法於實際配送情境下之可行性與有效性，相關結果彙整如</w:t>
+      </w:r>
       <w:r>
         <w:rPr>
           <w:rFonts w:eastAsia="標楷體"/>
@@ -14325,23 +13964,7 @@
           <w:rFonts w:eastAsia="標楷體" w:hint="eastAsia"/>
           <w:sz w:val="20"/>
         </w:rPr>
-        <w:t>表示</w:t>
-      </w:r>
-      <w:proofErr w:type="gramStart"/>
-      <w:r>
-        <w:rPr>
-          <w:rFonts w:eastAsia="標楷體" w:hint="eastAsia"/>
-          <w:sz w:val="20"/>
-        </w:rPr>
-        <w:t>準</w:t>
-      </w:r>
-      <w:proofErr w:type="gramEnd"/>
-      <w:r>
-        <w:rPr>
-          <w:rFonts w:eastAsia="標楷體" w:hint="eastAsia"/>
-          <w:sz w:val="20"/>
-        </w:rPr>
-        <w:t>點率</w:t>
+        <w:t>表示準點率</w:t>
       </w:r>
       <w:r>
         <w:rPr>
@@ -14532,21 +14155,12 @@
                 <w:sz w:val="20"/>
               </w:rPr>
             </w:pPr>
-            <w:proofErr w:type="gramStart"/>
             <w:r>
               <w:rPr>
                 <w:rFonts w:eastAsia="標楷體" w:hint="eastAsia"/>
                 <w:sz w:val="20"/>
               </w:rPr>
-              <w:t>Gap(</w:t>
-            </w:r>
-            <w:proofErr w:type="gramEnd"/>
-            <w:r>
-              <w:rPr>
-                <w:rFonts w:eastAsia="標楷體" w:hint="eastAsia"/>
-                <w:sz w:val="20"/>
-              </w:rPr>
-              <w:t>%)</w:t>
+              <w:t>Gap(%)</w:t>
             </w:r>
           </w:p>
         </w:tc>
@@ -15134,7 +14748,14 @@
                 <w:rFonts w:eastAsia="標楷體" w:hint="eastAsia"/>
                 <w:sz w:val="20"/>
               </w:rPr>
-              <w:t>16</w:t>
+              <w:t>1</w:t>
+            </w:r>
+            <w:r>
+              <w:rPr>
+                <w:rFonts w:eastAsia="標楷體" w:hint="eastAsia"/>
+                <w:sz w:val="20"/>
+              </w:rPr>
+              <w:t>4</w:t>
             </w:r>
           </w:p>
         </w:tc>
@@ -15213,23 +14834,7 @@
           <w:rFonts w:eastAsia="標楷體"/>
           <w:sz w:val="20"/>
         </w:rPr>
-        <w:t>為驗證各階段對整體配送結果影響，本研究針對所提出方法分別進行消融實驗。分別為將店</w:t>
-      </w:r>
-      <w:proofErr w:type="gramStart"/>
-      <w:r>
-        <w:rPr>
-          <w:rFonts w:eastAsia="標楷體"/>
-          <w:sz w:val="20"/>
-        </w:rPr>
-        <w:t>舖</w:t>
-      </w:r>
-      <w:proofErr w:type="gramEnd"/>
-      <w:r>
-        <w:rPr>
-          <w:rFonts w:eastAsia="標楷體"/>
-          <w:sz w:val="20"/>
-        </w:rPr>
-        <w:t>抽取方法改為隨機抽取，店鋪分配中只保留</w:t>
+        <w:t>為驗證各階段對整體配送結果影響，本研究針對所提出方法分別進行消融實驗。分別為將店舖抽取方法改為隨機抽取，店鋪分配中只保留</w:t>
       </w:r>
       <w:r>
         <w:rPr>
@@ -15370,23 +14975,7 @@
           <w:rFonts w:eastAsia="標楷體"/>
           <w:sz w:val="20"/>
         </w:rPr>
-        <w:t>結果可知，本研究所提出之完整方法於各指標皆取得最佳結果，而平均裝載率及</w:t>
-      </w:r>
-      <w:proofErr w:type="gramStart"/>
-      <w:r>
-        <w:rPr>
-          <w:rFonts w:eastAsia="標楷體"/>
-          <w:sz w:val="20"/>
-        </w:rPr>
-        <w:t>準</w:t>
-      </w:r>
-      <w:proofErr w:type="gramEnd"/>
-      <w:r>
-        <w:rPr>
-          <w:rFonts w:eastAsia="標楷體"/>
-          <w:sz w:val="20"/>
-        </w:rPr>
-        <w:t>點率於各方法大致保持相同。</w:t>
+        <w:t>結果可知，本研究所提出之完整方法於各指標皆取得最佳結果，而平均裝載率及準點率於各方法大致保持相同。</w:t>
       </w:r>
       <w:r>
         <w:rPr>
@@ -15520,23 +15109,7 @@
           <w:rFonts w:eastAsia="標楷體"/>
           <w:sz w:val="20"/>
         </w:rPr>
-        <w:t>，將店</w:t>
-      </w:r>
-      <w:proofErr w:type="gramStart"/>
-      <w:r>
-        <w:rPr>
-          <w:rFonts w:eastAsia="標楷體"/>
-          <w:sz w:val="20"/>
-        </w:rPr>
-        <w:t>舖</w:t>
-      </w:r>
-      <w:proofErr w:type="gramEnd"/>
-      <w:r>
-        <w:rPr>
-          <w:rFonts w:eastAsia="標楷體"/>
-          <w:sz w:val="20"/>
-        </w:rPr>
-        <w:t>抽取方法改為隨機抽取時，各項指標皆達到顯著差異</w:t>
+        <w:t>，將店舖抽取方法改為隨機抽取時，各項指標皆達到顯著差異</w:t>
       </w:r>
       <w:r>
         <w:rPr>
@@ -15550,23 +15123,7 @@
           <w:rFonts w:eastAsia="標楷體"/>
           <w:sz w:val="20"/>
         </w:rPr>
-        <w:t>當店</w:t>
-      </w:r>
-      <w:proofErr w:type="gramStart"/>
-      <w:r>
-        <w:rPr>
-          <w:rFonts w:eastAsia="標楷體"/>
-          <w:sz w:val="20"/>
-        </w:rPr>
-        <w:t>舖</w:t>
-      </w:r>
-      <w:proofErr w:type="gramEnd"/>
-      <w:r>
-        <w:rPr>
-          <w:rFonts w:eastAsia="標楷體"/>
-          <w:sz w:val="20"/>
-        </w:rPr>
-        <w:t>分配階段僅保留</w:t>
+        <w:t>當店舖分配階段僅保留</w:t>
       </w:r>
       <w:r>
         <w:rPr>
@@ -15657,23 +15214,7 @@
           <w:rFonts w:eastAsia="標楷體"/>
           <w:sz w:val="20"/>
         </w:rPr>
-        <w:t>於店</w:t>
-      </w:r>
-      <w:proofErr w:type="gramStart"/>
-      <w:r>
-        <w:rPr>
-          <w:rFonts w:eastAsia="標楷體"/>
-          <w:sz w:val="20"/>
-        </w:rPr>
-        <w:t>舖</w:t>
-      </w:r>
-      <w:proofErr w:type="gramEnd"/>
-      <w:r>
-        <w:rPr>
-          <w:rFonts w:eastAsia="標楷體"/>
-          <w:sz w:val="20"/>
-        </w:rPr>
-        <w:t>抽取、</w:t>
+        <w:t>於店舖抽取、</w:t>
       </w:r>
       <w:r>
         <w:rPr>
@@ -19162,23 +18703,7 @@
           <w:rFonts w:eastAsia="標楷體"/>
           <w:sz w:val="20"/>
         </w:rPr>
-        <w:t>相同，其餘案例則呈現相近但未明顯優於基準方法之結果。顯示本方法在多數情境下具有相近或</w:t>
-      </w:r>
-      <w:proofErr w:type="gramStart"/>
-      <w:r>
-        <w:rPr>
-          <w:rFonts w:eastAsia="標楷體"/>
-          <w:sz w:val="20"/>
-        </w:rPr>
-        <w:t>更佳解</w:t>
-      </w:r>
-      <w:proofErr w:type="gramEnd"/>
-      <w:r>
-        <w:rPr>
-          <w:rFonts w:eastAsia="標楷體"/>
-          <w:sz w:val="20"/>
-        </w:rPr>
-        <w:t>。進一步觀察可發現，本研究方法在多數測試案例中能有效維持或改善車輛使用數</w:t>
+        <w:t>相同，其餘案例則呈現相近但未明顯優於基準方法之結果。顯示本方法在多數情境下具有相近或更佳解。進一步觀察可發現，本研究方法在多數測試案例中能有效維持或改善車輛使用數</w:t>
       </w:r>
       <w:r>
         <w:rPr>
@@ -19257,23 +18782,7 @@
           <w:rFonts w:eastAsia="標楷體"/>
           <w:sz w:val="20"/>
         </w:rPr>
-        <w:t>本研究針對物流配送中固定主線架構下之路線最佳化問題進行探討，考量實務上主線店</w:t>
-      </w:r>
-      <w:proofErr w:type="gramStart"/>
-      <w:r>
-        <w:rPr>
-          <w:rFonts w:eastAsia="標楷體"/>
-          <w:sz w:val="20"/>
-        </w:rPr>
-        <w:t>舖</w:t>
-      </w:r>
-      <w:proofErr w:type="gramEnd"/>
-      <w:r>
-        <w:rPr>
-          <w:rFonts w:eastAsia="標楷體"/>
-          <w:sz w:val="20"/>
-        </w:rPr>
-        <w:t>順序不可變動、需求波動導致超載，以及需啟用支援線之情境，將問題建構為具時間窗限制之多階段組合最佳化問題。</w:t>
+        <w:t>本研究針對物流配送中固定主線架構下之路線最佳化問題進行探討，考量實務上主線店舖順序不可變動、需求波動導致超載，以及需啟用支援線之情境，將問題建構為具時間窗限制之多階段組合最佳化問題。</w:t>
       </w:r>
     </w:p>
     <w:p>
@@ -19290,71 +18799,7 @@
           <w:rFonts w:eastAsia="標楷體"/>
           <w:sz w:val="20"/>
         </w:rPr>
-        <w:t>為提升求解效率與解品質，本研究將問題拆分為主線超載店</w:t>
-      </w:r>
-      <w:proofErr w:type="gramStart"/>
-      <w:r>
-        <w:rPr>
-          <w:rFonts w:eastAsia="標楷體"/>
-          <w:sz w:val="20"/>
-        </w:rPr>
-        <w:t>舖</w:t>
-      </w:r>
-      <w:proofErr w:type="gramEnd"/>
-      <w:r>
-        <w:rPr>
-          <w:rFonts w:eastAsia="標楷體"/>
-          <w:sz w:val="20"/>
-        </w:rPr>
-        <w:t>抽取、候選店</w:t>
-      </w:r>
-      <w:proofErr w:type="gramStart"/>
-      <w:r>
-        <w:rPr>
-          <w:rFonts w:eastAsia="標楷體"/>
-          <w:sz w:val="20"/>
-        </w:rPr>
-        <w:t>舖</w:t>
-      </w:r>
-      <w:proofErr w:type="gramEnd"/>
-      <w:r>
-        <w:rPr>
-          <w:rFonts w:eastAsia="標楷體"/>
-          <w:sz w:val="20"/>
-        </w:rPr>
-        <w:t>重新分配及支援線規劃</w:t>
-      </w:r>
-      <w:proofErr w:type="gramStart"/>
-      <w:r>
-        <w:rPr>
-          <w:rFonts w:eastAsia="標楷體"/>
-          <w:sz w:val="20"/>
-        </w:rPr>
-        <w:t>三</w:t>
-      </w:r>
-      <w:proofErr w:type="gramEnd"/>
-      <w:r>
-        <w:rPr>
-          <w:rFonts w:eastAsia="標楷體"/>
-          <w:sz w:val="20"/>
-        </w:rPr>
-        <w:t>個子問題，並依其特性分別設計基因演算法</w:t>
-      </w:r>
-      <w:proofErr w:type="gramStart"/>
-      <w:r>
-        <w:rPr>
-          <w:rFonts w:eastAsia="標楷體"/>
-          <w:sz w:val="20"/>
-        </w:rPr>
-        <w:t>與蟻群演算法</w:t>
-      </w:r>
-      <w:proofErr w:type="gramEnd"/>
-      <w:r>
-        <w:rPr>
-          <w:rFonts w:eastAsia="標楷體"/>
-          <w:sz w:val="20"/>
-        </w:rPr>
-        <w:t>進行求解，同時結合修復機制以確保解之可行性。</w:t>
+        <w:t>為提升求解效率與解品質，本研究將問題拆分為主線超載店舖抽取、候選店舖重新分配及支援線規劃三個子問題，並依其特性分別設計基因演算法與蟻群演算法進行求解，同時結合修復機制以確保解之可行性。</w:t>
       </w:r>
       <w:r>
         <w:rPr>
@@ -19476,23 +18921,7 @@
           <w:rFonts w:eastAsia="標楷體"/>
           <w:sz w:val="20"/>
         </w:rPr>
-        <w:t>。</w:t>
-      </w:r>
-      <w:proofErr w:type="gramStart"/>
-      <w:r>
-        <w:rPr>
-          <w:rFonts w:eastAsia="標楷體"/>
-          <w:sz w:val="20"/>
-        </w:rPr>
-        <w:t>此外，</w:t>
-      </w:r>
-      <w:proofErr w:type="gramEnd"/>
-      <w:r>
-        <w:rPr>
-          <w:rFonts w:eastAsia="標楷體"/>
-          <w:sz w:val="20"/>
-        </w:rPr>
-        <w:t>亦可結合深度學習或強化學習方法，以提升大規模問題下之決策能力與效果，進一步擴展本</w:t>
+        <w:t>。此外，亦可結合深度學習或強化學習方法，以提升大規模問題下之決策能力與效果，進一步擴展本</w:t>
       </w:r>
       <w:r>
         <w:rPr>

</xml_diff>